<commit_message>
Report update and question 4
</commit_message>
<xml_diff>
--- a/docs/Relatorio.docx
+++ b/docs/Relatorio.docx
@@ -750,7 +750,7 @@
           <w:rFonts w:cs="Times"/>
           <w:noProof w:val="0"/>
           <w:szCs w:val="20"/>
-          <w:lang w:val="en-US"/>
+          <w:lang w:val="pt-BR"/>
         </w:rPr>
         <w:sectPr>
           <w:headerReference w:type="default" r:id="rId11"/>
@@ -783,12 +783,15 @@
       <w:pPr>
         <w:pStyle w:val="ndice1"/>
         <w:tabs>
-          <w:tab w:val="left" w:pos="422"/>
+          <w:tab w:val="left" w:pos="480"/>
           <w:tab w:val="right" w:leader="dot" w:pos="8494"/>
         </w:tabs>
         <w:rPr>
-          <w:szCs w:val="20"/>
-          <w:lang w:eastAsia="ja-JP"/>
+          <w:rFonts w:asciiTheme="minorHAnsi" w:hAnsiTheme="minorHAnsi"/>
+          <w:kern w:val="2"/>
+          <w:sz w:val="24"/>
+          <w:lang w:val="en-GB" w:eastAsia="en-GB"/>
+          <w14:ligatures w14:val="standardContextual"/>
         </w:rPr>
       </w:pPr>
       <w:r>
@@ -809,212 +812,634 @@
         </w:rPr>
         <w:fldChar w:fldCharType="separate"/>
       </w:r>
-      <w:r>
-        <w:rPr>
-          <w:szCs w:val="20"/>
-        </w:rPr>
-        <w:t>1.</w:t>
-      </w:r>
-      <w:r>
-        <w:rPr>
-          <w:szCs w:val="20"/>
-          <w:lang w:eastAsia="ja-JP"/>
-        </w:rPr>
-        <w:tab/>
-      </w:r>
-      <w:r>
-        <w:rPr>
-          <w:szCs w:val="20"/>
-        </w:rPr>
-        <w:t>Introdução</w:t>
-      </w:r>
-      <w:r>
-        <w:rPr>
-          <w:szCs w:val="20"/>
-        </w:rPr>
-        <w:tab/>
-      </w:r>
-      <w:r>
-        <w:rPr>
-          <w:szCs w:val="20"/>
-        </w:rPr>
-        <w:fldChar w:fldCharType="begin"/>
-      </w:r>
-      <w:r>
-        <w:rPr>
-          <w:szCs w:val="20"/>
-        </w:rPr>
-        <w:instrText xml:space="preserve"> PAGEREF _Toc351197350 \h </w:instrText>
-      </w:r>
-      <w:r>
-        <w:rPr>
-          <w:szCs w:val="20"/>
-        </w:rPr>
-      </w:r>
-      <w:r>
-        <w:rPr>
-          <w:szCs w:val="20"/>
-        </w:rPr>
-        <w:fldChar w:fldCharType="separate"/>
-      </w:r>
-      <w:r>
-        <w:rPr>
-          <w:szCs w:val="20"/>
-        </w:rPr>
-        <w:t>1</w:t>
-      </w:r>
-      <w:r>
-        <w:rPr>
-          <w:szCs w:val="20"/>
-        </w:rPr>
-        <w:fldChar w:fldCharType="end"/>
-      </w:r>
+      <w:hyperlink w:anchor="_Toc231567857" w:history="1">
+        <w:r>
+          <w:rPr>
+            <w:rStyle w:val="Hiperligao"/>
+          </w:rPr>
+          <w:t>1.</w:t>
+        </w:r>
+        <w:r>
+          <w:rPr>
+            <w:rFonts w:asciiTheme="minorHAnsi" w:hAnsiTheme="minorHAnsi"/>
+            <w:kern w:val="2"/>
+            <w:sz w:val="24"/>
+            <w:lang w:val="en-GB" w:eastAsia="en-GB"/>
+            <w14:ligatures w14:val="standardContextual"/>
+          </w:rPr>
+          <w:tab/>
+        </w:r>
+        <w:r>
+          <w:rPr>
+            <w:rStyle w:val="Hiperligao"/>
+          </w:rPr>
+          <w:t>Introdução</w:t>
+        </w:r>
+        <w:r>
+          <w:rPr>
+            <w:webHidden/>
+          </w:rPr>
+          <w:tab/>
+        </w:r>
+        <w:r>
+          <w:rPr>
+            <w:webHidden/>
+          </w:rPr>
+          <w:fldChar w:fldCharType="begin"/>
+        </w:r>
+        <w:r>
+          <w:rPr>
+            <w:webHidden/>
+          </w:rPr>
+          <w:instrText xml:space="preserve"> PAGEREF _Toc231567857 \h </w:instrText>
+        </w:r>
+        <w:r>
+          <w:rPr>
+            <w:webHidden/>
+          </w:rPr>
+        </w:r>
+        <w:r>
+          <w:rPr>
+            <w:webHidden/>
+          </w:rPr>
+          <w:fldChar w:fldCharType="separate"/>
+        </w:r>
+        <w:r>
+          <w:rPr>
+            <w:webHidden/>
+          </w:rPr>
+          <w:t>1</w:t>
+        </w:r>
+        <w:r>
+          <w:rPr>
+            <w:webHidden/>
+          </w:rPr>
+          <w:fldChar w:fldCharType="end"/>
+        </w:r>
+      </w:hyperlink>
+    </w:p>
+    <w:p>
+      <w:pPr>
+        <w:pStyle w:val="ndice2"/>
+        <w:tabs>
+          <w:tab w:val="right" w:leader="dot" w:pos="8494"/>
+        </w:tabs>
+      </w:pPr>
+      <w:hyperlink w:anchor="_Toc231567858" w:history="1">
+        <w:r>
+          <w:rPr>
+            <w:rStyle w:val="Hiperligao"/>
+          </w:rPr>
+          <w:t>Restrições de integridade</w:t>
+        </w:r>
+        <w:r>
+          <w:rPr>
+            <w:webHidden/>
+          </w:rPr>
+          <w:tab/>
+        </w:r>
+        <w:r>
+          <w:rPr>
+            <w:webHidden/>
+          </w:rPr>
+          <w:fldChar w:fldCharType="begin"/>
+        </w:r>
+        <w:r>
+          <w:rPr>
+            <w:webHidden/>
+          </w:rPr>
+          <w:instrText xml:space="preserve"> PAGEREF _Toc231567858 \h </w:instrText>
+        </w:r>
+        <w:r>
+          <w:rPr>
+            <w:webHidden/>
+          </w:rPr>
+        </w:r>
+        <w:r>
+          <w:rPr>
+            <w:webHidden/>
+          </w:rPr>
+          <w:fldChar w:fldCharType="separate"/>
+        </w:r>
+        <w:r>
+          <w:rPr>
+            <w:webHidden/>
+          </w:rPr>
+          <w:t>1</w:t>
+        </w:r>
+        <w:r>
+          <w:rPr>
+            <w:webHidden/>
+          </w:rPr>
+          <w:fldChar w:fldCharType="end"/>
+        </w:r>
+      </w:hyperlink>
+    </w:p>
+    <w:p>
+      <w:pPr>
+        <w:pStyle w:val="ndice2"/>
+        <w:tabs>
+          <w:tab w:val="right" w:leader="dot" w:pos="8494"/>
+        </w:tabs>
+      </w:pPr>
+      <w:hyperlink w:anchor="_Toc231567859" w:history="1">
+        <w:r>
+          <w:rPr>
+            <w:rStyle w:val="Hiperligao"/>
+          </w:rPr>
+          <w:t>Função fx-media-movel</w:t>
+        </w:r>
+        <w:r>
+          <w:rPr>
+            <w:webHidden/>
+          </w:rPr>
+          <w:tab/>
+        </w:r>
+        <w:r>
+          <w:rPr>
+            <w:webHidden/>
+          </w:rPr>
+          <w:fldChar w:fldCharType="begin"/>
+        </w:r>
+        <w:r>
+          <w:rPr>
+            <w:webHidden/>
+          </w:rPr>
+          <w:instrText xml:space="preserve"> PAGEREF _Toc231567859 \h </w:instrText>
+        </w:r>
+        <w:r>
+          <w:rPr>
+            <w:webHidden/>
+          </w:rPr>
+        </w:r>
+        <w:r>
+          <w:rPr>
+            <w:webHidden/>
+          </w:rPr>
+          <w:fldChar w:fldCharType="separate"/>
+        </w:r>
+        <w:r>
+          <w:rPr>
+            <w:webHidden/>
+          </w:rPr>
+          <w:t>3</w:t>
+        </w:r>
+        <w:r>
+          <w:rPr>
+            <w:webHidden/>
+          </w:rPr>
+          <w:fldChar w:fldCharType="end"/>
+        </w:r>
+      </w:hyperlink>
+    </w:p>
+    <w:p>
+      <w:pPr>
+        <w:pStyle w:val="ndice2"/>
+        <w:tabs>
+          <w:tab w:val="right" w:leader="dot" w:pos="8494"/>
+        </w:tabs>
+      </w:pPr>
+      <w:hyperlink w:anchor="_Toc231567860" w:history="1">
+        <w:r>
+          <w:rPr>
+            <w:rStyle w:val="Hiperligao"/>
+          </w:rPr>
+          <w:t>Função Portefolio_info</w:t>
+        </w:r>
+        <w:r>
+          <w:rPr>
+            <w:webHidden/>
+          </w:rPr>
+          <w:tab/>
+        </w:r>
+        <w:r>
+          <w:rPr>
+            <w:webHidden/>
+          </w:rPr>
+          <w:fldChar w:fldCharType="begin"/>
+        </w:r>
+        <w:r>
+          <w:rPr>
+            <w:webHidden/>
+          </w:rPr>
+          <w:instrText xml:space="preserve"> PAGEREF _Toc231567860 \h </w:instrText>
+        </w:r>
+        <w:r>
+          <w:rPr>
+            <w:webHidden/>
+          </w:rPr>
+        </w:r>
+        <w:r>
+          <w:rPr>
+            <w:webHidden/>
+          </w:rPr>
+          <w:fldChar w:fldCharType="separate"/>
+        </w:r>
+        <w:r>
+          <w:rPr>
+            <w:webHidden/>
+          </w:rPr>
+          <w:t>3</w:t>
+        </w:r>
+        <w:r>
+          <w:rPr>
+            <w:webHidden/>
+          </w:rPr>
+          <w:fldChar w:fldCharType="end"/>
+        </w:r>
+      </w:hyperlink>
+    </w:p>
+    <w:p>
+      <w:pPr>
+        <w:pStyle w:val="ndice2"/>
+        <w:tabs>
+          <w:tab w:val="right" w:leader="dot" w:pos="8494"/>
+        </w:tabs>
+      </w:pPr>
+      <w:hyperlink w:anchor="_Toc231567861" w:history="1">
+        <w:r>
+          <w:rPr>
+            <w:rStyle w:val="Hiperligao"/>
+            <w:lang w:val="pt-BR"/>
+          </w:rPr>
+          <w:t>Procedimento p_actualizaValorDiario</w:t>
+        </w:r>
+        <w:r>
+          <w:rPr>
+            <w:webHidden/>
+          </w:rPr>
+          <w:tab/>
+        </w:r>
+        <w:r>
+          <w:rPr>
+            <w:webHidden/>
+          </w:rPr>
+          <w:fldChar w:fldCharType="begin"/>
+        </w:r>
+        <w:r>
+          <w:rPr>
+            <w:webHidden/>
+          </w:rPr>
+          <w:instrText xml:space="preserve"> PAGEREF _Toc231567861 \h </w:instrText>
+        </w:r>
+        <w:r>
+          <w:rPr>
+            <w:webHidden/>
+          </w:rPr>
+        </w:r>
+        <w:r>
+          <w:rPr>
+            <w:webHidden/>
+          </w:rPr>
+          <w:fldChar w:fldCharType="separate"/>
+        </w:r>
+        <w:r>
+          <w:rPr>
+            <w:webHidden/>
+          </w:rPr>
+          <w:t>3</w:t>
+        </w:r>
+        <w:r>
+          <w:rPr>
+            <w:webHidden/>
+          </w:rPr>
+          <w:fldChar w:fldCharType="end"/>
+        </w:r>
+      </w:hyperlink>
+    </w:p>
+    <w:p>
+      <w:pPr>
+        <w:pStyle w:val="ndice2"/>
+        <w:tabs>
+          <w:tab w:val="right" w:leader="dot" w:pos="8494"/>
+        </w:tabs>
+      </w:pPr>
+      <w:hyperlink w:anchor="_Toc231567862" w:history="1">
+        <w:r>
+          <w:rPr>
+            <w:rStyle w:val="Hiperligao"/>
+            <w:lang w:val="pt-BR"/>
+          </w:rPr>
+          <w:t>Vista contacto_cliente</w:t>
+        </w:r>
+        <w:r>
+          <w:rPr>
+            <w:webHidden/>
+          </w:rPr>
+          <w:tab/>
+        </w:r>
+        <w:r>
+          <w:rPr>
+            <w:webHidden/>
+          </w:rPr>
+          <w:fldChar w:fldCharType="begin"/>
+        </w:r>
+        <w:r>
+          <w:rPr>
+            <w:webHidden/>
+          </w:rPr>
+          <w:instrText xml:space="preserve"> PAGEREF _Toc231567862 \h </w:instrText>
+        </w:r>
+        <w:r>
+          <w:rPr>
+            <w:webHidden/>
+          </w:rPr>
+        </w:r>
+        <w:r>
+          <w:rPr>
+            <w:webHidden/>
+          </w:rPr>
+          <w:fldChar w:fldCharType="separate"/>
+        </w:r>
+        <w:r>
+          <w:rPr>
+            <w:webHidden/>
+          </w:rPr>
+          <w:t>3</w:t>
+        </w:r>
+        <w:r>
+          <w:rPr>
+            <w:webHidden/>
+          </w:rPr>
+          <w:fldChar w:fldCharType="end"/>
+        </w:r>
+      </w:hyperlink>
+    </w:p>
+    <w:p>
+      <w:pPr>
+        <w:pStyle w:val="ndice2"/>
+        <w:tabs>
+          <w:tab w:val="right" w:leader="dot" w:pos="8494"/>
+        </w:tabs>
+      </w:pPr>
+      <w:hyperlink w:anchor="_Toc231567863" w:history="1">
+        <w:r>
+          <w:rPr>
+            <w:rStyle w:val="Hiperligao"/>
+          </w:rPr>
+          <w:t>Aplicação Java</w:t>
+        </w:r>
+        <w:r>
+          <w:rPr>
+            <w:webHidden/>
+          </w:rPr>
+          <w:tab/>
+        </w:r>
+        <w:r>
+          <w:rPr>
+            <w:webHidden/>
+          </w:rPr>
+          <w:fldChar w:fldCharType="begin"/>
+        </w:r>
+        <w:r>
+          <w:rPr>
+            <w:webHidden/>
+          </w:rPr>
+          <w:instrText xml:space="preserve"> PAGEREF _Toc231567863 \h </w:instrText>
+        </w:r>
+        <w:r>
+          <w:rPr>
+            <w:webHidden/>
+          </w:rPr>
+        </w:r>
+        <w:r>
+          <w:rPr>
+            <w:webHidden/>
+          </w:rPr>
+          <w:fldChar w:fldCharType="separate"/>
+        </w:r>
+        <w:r>
+          <w:rPr>
+            <w:webHidden/>
+          </w:rPr>
+          <w:t>3</w:t>
+        </w:r>
+        <w:r>
+          <w:rPr>
+            <w:webHidden/>
+          </w:rPr>
+          <w:fldChar w:fldCharType="end"/>
+        </w:r>
+      </w:hyperlink>
+    </w:p>
+    <w:p>
+      <w:pPr>
+        <w:pStyle w:val="ndice2"/>
+        <w:tabs>
+          <w:tab w:val="right" w:leader="dot" w:pos="8494"/>
+        </w:tabs>
+      </w:pPr>
+      <w:hyperlink w:anchor="_Toc231567864" w:history="1">
+        <w:r>
+          <w:rPr>
+            <w:rStyle w:val="Hiperligao"/>
+          </w:rPr>
+          <w:t>Teste Optimistic Locking</w:t>
+        </w:r>
+        <w:r>
+          <w:rPr>
+            <w:webHidden/>
+          </w:rPr>
+          <w:tab/>
+        </w:r>
+        <w:r>
+          <w:rPr>
+            <w:webHidden/>
+          </w:rPr>
+          <w:fldChar w:fldCharType="begin"/>
+        </w:r>
+        <w:r>
+          <w:rPr>
+            <w:webHidden/>
+          </w:rPr>
+          <w:instrText xml:space="preserve"> PAGEREF _Toc231567864 \h </w:instrText>
+        </w:r>
+        <w:r>
+          <w:rPr>
+            <w:webHidden/>
+          </w:rPr>
+        </w:r>
+        <w:r>
+          <w:rPr>
+            <w:webHidden/>
+          </w:rPr>
+          <w:fldChar w:fldCharType="separate"/>
+        </w:r>
+        <w:r>
+          <w:rPr>
+            <w:webHidden/>
+          </w:rPr>
+          <w:t>3</w:t>
+        </w:r>
+        <w:r>
+          <w:rPr>
+            <w:webHidden/>
+          </w:rPr>
+          <w:fldChar w:fldCharType="end"/>
+        </w:r>
+      </w:hyperlink>
     </w:p>
     <w:p>
       <w:pPr>
         <w:pStyle w:val="ndice1"/>
         <w:tabs>
-          <w:tab w:val="left" w:pos="422"/>
+          <w:tab w:val="left" w:pos="480"/>
           <w:tab w:val="right" w:leader="dot" w:pos="8494"/>
         </w:tabs>
         <w:rPr>
-          <w:szCs w:val="20"/>
-          <w:lang w:eastAsia="ja-JP"/>
-        </w:rPr>
-      </w:pPr>
-      <w:r>
-        <w:rPr>
-          <w:szCs w:val="20"/>
-        </w:rPr>
-        <w:t>2.</w:t>
-      </w:r>
-      <w:r>
-        <w:rPr>
-          <w:szCs w:val="20"/>
-          <w:lang w:eastAsia="ja-JP"/>
-        </w:rPr>
-        <w:tab/>
-      </w:r>
-      <w:r>
-        <w:rPr>
-          <w:szCs w:val="20"/>
-        </w:rPr>
-        <w:t>Tutorial</w:t>
-      </w:r>
-      <w:r>
-        <w:rPr>
-          <w:szCs w:val="20"/>
-        </w:rPr>
-        <w:tab/>
-      </w:r>
-      <w:r>
-        <w:rPr>
-          <w:szCs w:val="20"/>
-        </w:rPr>
-        <w:fldChar w:fldCharType="begin"/>
-      </w:r>
-      <w:r>
-        <w:rPr>
-          <w:szCs w:val="20"/>
-        </w:rPr>
-        <w:instrText xml:space="preserve"> PAGEREF _Toc351197351 \h </w:instrText>
-      </w:r>
-      <w:r>
-        <w:rPr>
-          <w:szCs w:val="20"/>
-        </w:rPr>
-      </w:r>
-      <w:r>
-        <w:rPr>
-          <w:szCs w:val="20"/>
-        </w:rPr>
-        <w:fldChar w:fldCharType="separate"/>
-      </w:r>
-      <w:r>
-        <w:rPr>
-          <w:szCs w:val="20"/>
-        </w:rPr>
-        <w:t>4</w:t>
-      </w:r>
-      <w:r>
-        <w:rPr>
-          <w:szCs w:val="20"/>
-        </w:rPr>
-        <w:fldChar w:fldCharType="end"/>
-      </w:r>
+          <w:rFonts w:asciiTheme="minorHAnsi" w:hAnsiTheme="minorHAnsi"/>
+          <w:kern w:val="2"/>
+          <w:sz w:val="24"/>
+          <w:lang w:val="en-GB" w:eastAsia="en-GB"/>
+          <w14:ligatures w14:val="standardContextual"/>
+        </w:rPr>
+      </w:pPr>
+      <w:hyperlink w:anchor="_Toc231567865" w:history="1">
+        <w:r>
+          <w:rPr>
+            <w:rStyle w:val="Hiperligao"/>
+          </w:rPr>
+          <w:t>2.</w:t>
+        </w:r>
+        <w:r>
+          <w:rPr>
+            <w:rFonts w:asciiTheme="minorHAnsi" w:hAnsiTheme="minorHAnsi"/>
+            <w:kern w:val="2"/>
+            <w:sz w:val="24"/>
+            <w:lang w:val="en-GB" w:eastAsia="en-GB"/>
+            <w14:ligatures w14:val="standardContextual"/>
+          </w:rPr>
+          <w:tab/>
+        </w:r>
+        <w:r>
+          <w:rPr>
+            <w:rStyle w:val="Hiperligao"/>
+          </w:rPr>
+          <w:t>Tutorial</w:t>
+        </w:r>
+        <w:r>
+          <w:rPr>
+            <w:webHidden/>
+          </w:rPr>
+          <w:tab/>
+        </w:r>
+        <w:r>
+          <w:rPr>
+            <w:webHidden/>
+          </w:rPr>
+          <w:fldChar w:fldCharType="begin"/>
+        </w:r>
+        <w:r>
+          <w:rPr>
+            <w:webHidden/>
+          </w:rPr>
+          <w:instrText xml:space="preserve"> PAGEREF _Toc231567865 \h </w:instrText>
+        </w:r>
+        <w:r>
+          <w:rPr>
+            <w:webHidden/>
+          </w:rPr>
+        </w:r>
+        <w:r>
+          <w:rPr>
+            <w:webHidden/>
+          </w:rPr>
+          <w:fldChar w:fldCharType="separate"/>
+        </w:r>
+        <w:r>
+          <w:rPr>
+            <w:webHidden/>
+          </w:rPr>
+          <w:t>5</w:t>
+        </w:r>
+        <w:r>
+          <w:rPr>
+            <w:webHidden/>
+          </w:rPr>
+          <w:fldChar w:fldCharType="end"/>
+        </w:r>
+      </w:hyperlink>
     </w:p>
     <w:p>
       <w:pPr>
         <w:pStyle w:val="ndice1"/>
         <w:tabs>
-          <w:tab w:val="left" w:pos="422"/>
+          <w:tab w:val="left" w:pos="480"/>
           <w:tab w:val="right" w:leader="dot" w:pos="8494"/>
         </w:tabs>
         <w:rPr>
-          <w:szCs w:val="20"/>
-          <w:lang w:eastAsia="ja-JP"/>
-        </w:rPr>
-      </w:pPr>
-      <w:r>
-        <w:rPr>
-          <w:szCs w:val="20"/>
-        </w:rPr>
-        <w:t>3.</w:t>
-      </w:r>
-      <w:r>
-        <w:rPr>
-          <w:szCs w:val="20"/>
-          <w:lang w:eastAsia="ja-JP"/>
-        </w:rPr>
-        <w:tab/>
-      </w:r>
-      <w:r>
-        <w:rPr>
-          <w:szCs w:val="20"/>
-        </w:rPr>
-        <w:t>Referências</w:t>
-      </w:r>
-      <w:r>
-        <w:rPr>
-          <w:szCs w:val="20"/>
-        </w:rPr>
-        <w:tab/>
-      </w:r>
-      <w:r>
-        <w:rPr>
-          <w:szCs w:val="20"/>
-        </w:rPr>
-        <w:fldChar w:fldCharType="begin"/>
-      </w:r>
-      <w:r>
-        <w:rPr>
-          <w:szCs w:val="20"/>
-        </w:rPr>
-        <w:instrText xml:space="preserve"> PAGEREF _Toc351197352 \h </w:instrText>
-      </w:r>
-      <w:r>
-        <w:rPr>
-          <w:szCs w:val="20"/>
-        </w:rPr>
-      </w:r>
-      <w:r>
-        <w:rPr>
-          <w:szCs w:val="20"/>
-        </w:rPr>
-        <w:fldChar w:fldCharType="separate"/>
-      </w:r>
-      <w:r>
-        <w:rPr>
-          <w:szCs w:val="20"/>
-        </w:rPr>
-        <w:t>6</w:t>
-      </w:r>
-      <w:r>
-        <w:rPr>
-          <w:szCs w:val="20"/>
-        </w:rPr>
-        <w:fldChar w:fldCharType="end"/>
-      </w:r>
+          <w:rFonts w:asciiTheme="minorHAnsi" w:hAnsiTheme="minorHAnsi"/>
+          <w:kern w:val="2"/>
+          <w:sz w:val="24"/>
+          <w:lang w:val="en-GB" w:eastAsia="en-GB"/>
+          <w14:ligatures w14:val="standardContextual"/>
+        </w:rPr>
+      </w:pPr>
+      <w:hyperlink w:anchor="_Toc231567866" w:history="1">
+        <w:r>
+          <w:rPr>
+            <w:rStyle w:val="Hiperligao"/>
+          </w:rPr>
+          <w:t>3.</w:t>
+        </w:r>
+        <w:r>
+          <w:rPr>
+            <w:rFonts w:asciiTheme="minorHAnsi" w:hAnsiTheme="minorHAnsi"/>
+            <w:kern w:val="2"/>
+            <w:sz w:val="24"/>
+            <w:lang w:val="en-GB" w:eastAsia="en-GB"/>
+            <w14:ligatures w14:val="standardContextual"/>
+          </w:rPr>
+          <w:tab/>
+        </w:r>
+        <w:r>
+          <w:rPr>
+            <w:rStyle w:val="Hiperligao"/>
+          </w:rPr>
+          <w:t>Referências</w:t>
+        </w:r>
+        <w:r>
+          <w:rPr>
+            <w:webHidden/>
+          </w:rPr>
+          <w:tab/>
+        </w:r>
+        <w:r>
+          <w:rPr>
+            <w:webHidden/>
+          </w:rPr>
+          <w:fldChar w:fldCharType="begin"/>
+        </w:r>
+        <w:r>
+          <w:rPr>
+            <w:webHidden/>
+          </w:rPr>
+          <w:instrText xml:space="preserve"> PAGEREF _Toc231567866 \h </w:instrText>
+        </w:r>
+        <w:r>
+          <w:rPr>
+            <w:webHidden/>
+          </w:rPr>
+        </w:r>
+        <w:r>
+          <w:rPr>
+            <w:webHidden/>
+          </w:rPr>
+          <w:fldChar w:fldCharType="separate"/>
+        </w:r>
+        <w:r>
+          <w:rPr>
+            <w:webHidden/>
+          </w:rPr>
+          <w:t>8</w:t>
+        </w:r>
+        <w:r>
+          <w:rPr>
+            <w:webHidden/>
+          </w:rPr>
+          <w:fldChar w:fldCharType="end"/>
+        </w:r>
+      </w:hyperlink>
     </w:p>
     <w:p>
       <w:pPr>
@@ -1064,8 +1489,11 @@
           <w:tab w:val="right" w:leader="dot" w:pos="8494"/>
         </w:tabs>
         <w:rPr>
-          <w:szCs w:val="20"/>
-          <w:lang w:eastAsia="ja-JP"/>
+          <w:rFonts w:asciiTheme="minorHAnsi" w:hAnsiTheme="minorHAnsi"/>
+          <w:kern w:val="2"/>
+          <w:sz w:val="24"/>
+          <w:lang w:val="pt-BR" w:eastAsia="en-GB"/>
+          <w14:ligatures w14:val="standardContextual"/>
         </w:rPr>
       </w:pPr>
       <w:r>
@@ -1087,50 +1515,60 @@
         <w:fldChar w:fldCharType="separate"/>
       </w:r>
       <w:r>
-        <w:rPr>
-          <w:szCs w:val="20"/>
-        </w:rPr>
-        <w:t>Figura 1 Ilustração de uma imagem não vectorial (à esquerda) e vectorial (à direita)</w:t>
-      </w:r>
-      <w:r>
-        <w:rPr>
-          <w:szCs w:val="20"/>
-        </w:rPr>
+        <w:t>Figura 1 - Código da questão 1.a</w:t>
+      </w:r>
+      <w:r>
         <w:tab/>
       </w:r>
       <w:r>
-        <w:rPr>
-          <w:szCs w:val="20"/>
-        </w:rPr>
         <w:fldChar w:fldCharType="begin"/>
       </w:r>
       <w:r>
-        <w:rPr>
-          <w:szCs w:val="20"/>
-        </w:rPr>
-        <w:instrText xml:space="preserve"> PAGEREF _Toc351197325 \h </w:instrText>
-      </w:r>
-      <w:r>
-        <w:rPr>
-          <w:szCs w:val="20"/>
-        </w:rPr>
-      </w:r>
-      <w:r>
-        <w:rPr>
-          <w:szCs w:val="20"/>
-        </w:rPr>
+        <w:instrText xml:space="preserve"> PAGEREF _Toc231567881 \h </w:instrText>
+      </w:r>
+      <w:r>
         <w:fldChar w:fldCharType="separate"/>
       </w:r>
       <w:r>
-        <w:rPr>
-          <w:szCs w:val="20"/>
-        </w:rPr>
-        <w:t>4</w:t>
-      </w:r>
-      <w:r>
-        <w:rPr>
-          <w:szCs w:val="20"/>
-        </w:rPr>
+        <w:t>1</w:t>
+      </w:r>
+      <w:r>
+        <w:fldChar w:fldCharType="end"/>
+      </w:r>
+    </w:p>
+    <w:p>
+      <w:pPr>
+        <w:pStyle w:val="ndicedeilustraes"/>
+        <w:tabs>
+          <w:tab w:val="right" w:leader="dot" w:pos="8494"/>
+        </w:tabs>
+        <w:rPr>
+          <w:rFonts w:asciiTheme="minorHAnsi" w:hAnsiTheme="minorHAnsi"/>
+          <w:kern w:val="2"/>
+          <w:sz w:val="24"/>
+          <w:lang w:val="pt-BR" w:eastAsia="en-GB"/>
+          <w14:ligatures w14:val="standardContextual"/>
+        </w:rPr>
+      </w:pPr>
+      <w:r>
+        <w:t>Figura 2 Ilustração de uma imagem não vectorial (à esquerda) e vectorial (à direita)</w:t>
+      </w:r>
+      <w:r>
+        <w:tab/>
+      </w:r>
+      <w:r>
+        <w:fldChar w:fldCharType="begin"/>
+      </w:r>
+      <w:r>
+        <w:instrText xml:space="preserve"> PAGEREF _Toc231567882 \h </w:instrText>
+      </w:r>
+      <w:r>
+        <w:fldChar w:fldCharType="separate"/>
+      </w:r>
+      <w:r>
+        <w:t>6</w:t>
+      </w:r>
+      <w:r>
         <w:fldChar w:fldCharType="end"/>
       </w:r>
     </w:p>
@@ -1473,7 +1911,7 @@
       <w:pPr>
         <w:pStyle w:val="Ttulo1"/>
       </w:pPr>
-      <w:bookmarkStart w:id="0" w:name="_Toc351197350"/>
+      <w:bookmarkStart w:id="0" w:name="_Toc231567857"/>
       <w:r>
         <w:lastRenderedPageBreak/>
         <w:t>Introdução</w:t>
@@ -1495,22 +1933,25 @@
     </w:p>
     <w:p>
       <w:pPr>
-        <w:rPr>
-          <w:szCs w:val="20"/>
-        </w:rPr>
-      </w:pPr>
+        <w:pStyle w:val="Ttulo1"/>
+      </w:pPr>
+      <w:r>
+        <w:t>Resultados</w:t>
+      </w:r>
     </w:p>
     <w:p>
       <w:pPr>
         <w:pStyle w:val="Ttulo2"/>
       </w:pPr>
+      <w:bookmarkStart w:id="1" w:name="_Toc231567858"/>
       <w:r>
         <w:t>Restrições de integridade</w:t>
       </w:r>
-    </w:p>
-    <w:p>
-      <w:pPr>
-        <w:pStyle w:val="ListParagraph"/>
+      <w:bookmarkEnd w:id="1"/>
+    </w:p>
+    <w:p>
+      <w:pPr>
+        <w:pStyle w:val="PargrafodaLista1"/>
         <w:numPr>
           <w:ilvl w:val="0"/>
           <w:numId w:val="0"/>
@@ -1523,7 +1964,7 @@
     </w:p>
     <w:p>
       <w:pPr>
-        <w:pStyle w:val="ListParagraph"/>
+        <w:pStyle w:val="PargrafodaLista1"/>
         <w:numPr>
           <w:ilvl w:val="0"/>
           <w:numId w:val="0"/>
@@ -1542,7 +1983,7 @@
     </w:p>
     <w:p>
       <w:pPr>
-        <w:pStyle w:val="ListParagraph"/>
+        <w:pStyle w:val="PargrafodaLista1"/>
         <w:numPr>
           <w:ilvl w:val="0"/>
           <w:numId w:val="0"/>
@@ -1561,7 +2002,7 @@
     </w:p>
     <w:p>
       <w:pPr>
-        <w:pStyle w:val="ListParagraph"/>
+        <w:pStyle w:val="PargrafodaLista1"/>
         <w:numPr>
           <w:ilvl w:val="0"/>
           <w:numId w:val="0"/>
@@ -1605,7 +2046,13 @@
           <w:bCs/>
           <w:szCs w:val="20"/>
         </w:rPr>
-        <w:t>“</w:t>
+        <w:t>“^[0-9]{9}$”</w:t>
+      </w:r>
+      <w:r>
+        <w:rPr>
+          <w:szCs w:val="20"/>
+        </w:rPr>
+        <w:t xml:space="preserve">. Os elementos </w:t>
       </w:r>
       <w:r>
         <w:rPr>
@@ -1613,7 +2060,13 @@
           <w:bCs/>
           <w:szCs w:val="20"/>
         </w:rPr>
-        <w:t>^[0-9]{9}$</w:t>
+        <w:t>‘^’</w:t>
+      </w:r>
+      <w:r>
+        <w:rPr>
+          <w:szCs w:val="20"/>
+        </w:rPr>
+        <w:t xml:space="preserve"> e </w:t>
       </w:r>
       <w:r>
         <w:rPr>
@@ -1621,13 +2074,13 @@
           <w:bCs/>
           <w:szCs w:val="20"/>
         </w:rPr>
-        <w:t>”</w:t>
-      </w:r>
-      <w:r>
-        <w:rPr>
-          <w:szCs w:val="20"/>
-        </w:rPr>
-        <w:t xml:space="preserve">. Os elementos </w:t>
+        <w:t>‘$’</w:t>
+      </w:r>
+      <w:r>
+        <w:rPr>
+          <w:szCs w:val="20"/>
+        </w:rPr>
+        <w:t xml:space="preserve"> representam o inicio e o fim da string, respetivamente, o elemento </w:t>
       </w:r>
       <w:r>
         <w:rPr>
@@ -1635,13 +2088,13 @@
           <w:bCs/>
           <w:szCs w:val="20"/>
         </w:rPr>
-        <w:t>‘^’</w:t>
-      </w:r>
-      <w:r>
-        <w:rPr>
-          <w:szCs w:val="20"/>
-        </w:rPr>
-        <w:t xml:space="preserve"> e </w:t>
+        <w:t>‘[0-9]</w:t>
+      </w:r>
+      <w:r>
+        <w:rPr>
+          <w:szCs w:val="20"/>
+        </w:rPr>
+        <w:t xml:space="preserve">’ verifica se só existem digitos entre 0 e 9 e o elemento </w:t>
       </w:r>
       <w:r>
         <w:rPr>
@@ -1649,13 +2102,7 @@
           <w:bCs/>
           <w:szCs w:val="20"/>
         </w:rPr>
-        <w:t>‘$’</w:t>
-      </w:r>
-      <w:r>
-        <w:rPr>
-          <w:szCs w:val="20"/>
-        </w:rPr>
-        <w:t xml:space="preserve"> representam o inicio e o fim da string, respetivamente, o elemento </w:t>
+        <w:t>‘{9}’</w:t>
       </w:r>
       <w:r>
         <w:rPr>
@@ -1663,28 +2110,6 @@
           <w:bCs/>
           <w:szCs w:val="20"/>
         </w:rPr>
-        <w:t>‘[0-9]</w:t>
-      </w:r>
-      <w:r>
-        <w:rPr>
-          <w:szCs w:val="20"/>
-        </w:rPr>
-        <w:t xml:space="preserve">’ verifica se só existem digitos entre 0 e 9 e o elemento </w:t>
-      </w:r>
-      <w:r>
-        <w:rPr>
-          <w:b/>
-          <w:bCs/>
-          <w:szCs w:val="20"/>
-        </w:rPr>
-        <w:t>‘{9}’</w:t>
-      </w:r>
-      <w:r>
-        <w:rPr>
-          <w:b/>
-          <w:bCs/>
-          <w:szCs w:val="20"/>
-        </w:rPr>
         <w:t xml:space="preserve"> </w:t>
       </w:r>
       <w:r>
@@ -1696,7 +2121,7 @@
     </w:p>
     <w:p>
       <w:pPr>
-        <w:pStyle w:val="ListParagraph"/>
+        <w:pStyle w:val="PargrafodaLista1"/>
         <w:numPr>
           <w:ilvl w:val="0"/>
           <w:numId w:val="0"/>
@@ -1749,7 +2174,35 @@
           <w:szCs w:val="20"/>
           <w:lang w:val="pt-BR"/>
         </w:rPr>
-        <w:t xml:space="preserve">. Seria válido utilizar o </w:t>
+        <w:t xml:space="preserve">. </w:t>
+      </w:r>
+      <w:r>
+        <w:rPr>
+          <w:szCs w:val="20"/>
+          <w:lang w:val="pt-BR"/>
+        </w:rPr>
+        <w:t xml:space="preserve">Poderia-se utilziar </w:t>
+      </w:r>
+      <w:r>
+        <w:rPr>
+          <w:szCs w:val="20"/>
+          <w:lang w:val="pt-BR"/>
+        </w:rPr>
+        <w:t>o</w:t>
+      </w:r>
+      <w:r>
+        <w:rPr>
+          <w:szCs w:val="20"/>
+          <w:lang w:val="pt-BR"/>
+        </w:rPr>
+        <w:t xml:space="preserve"> trigger</w:t>
+      </w:r>
+      <w:r>
+        <w:rPr>
+          <w:szCs w:val="20"/>
+          <w:lang w:val="pt-BR"/>
+        </w:rPr>
+        <w:t xml:space="preserve"> </w:t>
       </w:r>
       <w:r>
         <w:rPr>
@@ -1767,10 +2220,17 @@
         </w:rPr>
         <w:t xml:space="preserve"> neste caso porque temos a validação na mesma, o que permite o rollback da inserção ou atualização, contudo não é usual utilizar AFTER em contexto de inserção ou atualização de dados</w:t>
       </w:r>
-    </w:p>
-    <w:p>
-      <w:pPr>
-        <w:pStyle w:val="ListParagraph"/>
+      <w:r>
+        <w:rPr>
+          <w:szCs w:val="20"/>
+          <w:lang w:val="pt-BR"/>
+        </w:rPr>
+        <w:t>.</w:t>
+      </w:r>
+    </w:p>
+    <w:p>
+      <w:pPr>
+        <w:pStyle w:val="PargrafodaLista1"/>
         <w:numPr>
           <w:ilvl w:val="0"/>
           <w:numId w:val="0"/>
@@ -1784,7 +2244,7 @@
     </w:p>
     <w:p>
       <w:pPr>
-        <w:pStyle w:val="ListParagraph"/>
+        <w:pStyle w:val="PargrafodaLista1"/>
         <w:keepNext/>
         <w:numPr>
           <w:ilvl w:val="0"/>
@@ -1834,6 +2294,7 @@
       <w:pPr>
         <w:pStyle w:val="Legenda"/>
       </w:pPr>
+      <w:bookmarkStart w:id="2" w:name="_Toc231567881"/>
       <w:r>
         <w:t xml:space="preserve">Figura </w:t>
       </w:r>
@@ -1855,8 +2316,8 @@
       <w:r>
         <w:t xml:space="preserve"> - Código da questão 1.a</w:t>
       </w:r>
-    </w:p>
-    <w:p/>
+      <w:bookmarkEnd w:id="2"/>
+    </w:p>
     <w:p/>
     <w:p>
       <w:pPr>
@@ -1875,7 +2336,7 @@
     </w:p>
     <w:p>
       <w:pPr>
-        <w:pStyle w:val="ListParagraph"/>
+        <w:pStyle w:val="PargrafodaLista1"/>
         <w:numPr>
           <w:ilvl w:val="0"/>
           <w:numId w:val="0"/>
@@ -1885,10 +2346,210 @@
           <w:szCs w:val="20"/>
         </w:rPr>
       </w:pPr>
-    </w:p>
-    <w:p>
-      <w:pPr>
-        <w:pStyle w:val="ListParagraph"/>
+      <w:r>
+        <w:rPr>
+          <w:szCs w:val="20"/>
+        </w:rPr>
+        <w:lastRenderedPageBreak/>
+        <w:t xml:space="preserve">Este trigger tem como objetivo verificar duplicados de email e telefone na </w:t>
+      </w:r>
+    </w:p>
+    <w:p>
+      <w:pPr>
+        <w:pStyle w:val="PargrafodaLista1"/>
+        <w:numPr>
+          <w:ilvl w:val="0"/>
+          <w:numId w:val="0"/>
+        </w:numPr>
+        <w:ind w:left="720" w:hanging="360"/>
+        <w:rPr>
+          <w:szCs w:val="20"/>
+        </w:rPr>
+      </w:pPr>
+      <w:r>
+        <w:rPr>
+          <w:szCs w:val="20"/>
+        </w:rPr>
+        <w:t>inserção e atualização das tabelas de contacto_email e contacto_telefone.</w:t>
+      </w:r>
+    </w:p>
+    <w:p>
+      <w:pPr>
+        <w:pStyle w:val="PargrafodaLista1"/>
+        <w:numPr>
+          <w:ilvl w:val="0"/>
+          <w:numId w:val="0"/>
+        </w:numPr>
+        <w:ind w:left="720" w:hanging="360"/>
+        <w:rPr>
+          <w:szCs w:val="20"/>
+        </w:rPr>
+      </w:pPr>
+    </w:p>
+    <w:p>
+      <w:pPr>
+        <w:pStyle w:val="PargrafodaLista1"/>
+        <w:numPr>
+          <w:ilvl w:val="0"/>
+          <w:numId w:val="0"/>
+        </w:numPr>
+        <w:ind w:left="720" w:hanging="360"/>
+        <w:rPr>
+          <w:szCs w:val="20"/>
+        </w:rPr>
+      </w:pPr>
+      <w:r>
+        <w:rPr>
+          <w:szCs w:val="20"/>
+        </w:rPr>
+        <w:t xml:space="preserve">Procedeu-se à implementação de uma só função para a validação dos </w:t>
+      </w:r>
+    </w:p>
+    <w:p>
+      <w:pPr>
+        <w:pStyle w:val="PargrafodaLista1"/>
+        <w:numPr>
+          <w:ilvl w:val="0"/>
+          <w:numId w:val="0"/>
+        </w:numPr>
+        <w:ind w:left="720" w:hanging="360"/>
+        <w:rPr>
+          <w:szCs w:val="20"/>
+        </w:rPr>
+      </w:pPr>
+      <w:r>
+        <w:rPr>
+          <w:szCs w:val="20"/>
+        </w:rPr>
+        <w:t xml:space="preserve">duplicados com recurso a variáveis especiais do PostgreSQL </w:t>
+      </w:r>
+      <w:r>
+        <w:rPr>
+          <w:b/>
+          <w:bCs/>
+          <w:szCs w:val="20"/>
+        </w:rPr>
+        <w:t>“TG_OP”</w:t>
+      </w:r>
+      <w:r>
+        <w:rPr>
+          <w:szCs w:val="20"/>
+        </w:rPr>
+        <w:t xml:space="preserve"> e</w:t>
+      </w:r>
+    </w:p>
+    <w:p>
+      <w:pPr>
+        <w:pStyle w:val="PargrafodaLista1"/>
+        <w:numPr>
+          <w:ilvl w:val="0"/>
+          <w:numId w:val="0"/>
+        </w:numPr>
+        <w:ind w:left="720" w:hanging="360"/>
+        <w:rPr>
+          <w:szCs w:val="20"/>
+        </w:rPr>
+      </w:pPr>
+      <w:r>
+        <w:rPr>
+          <w:szCs w:val="20"/>
+        </w:rPr>
+        <w:t xml:space="preserve"> </w:t>
+      </w:r>
+      <w:r>
+        <w:rPr>
+          <w:b/>
+          <w:bCs/>
+          <w:szCs w:val="20"/>
+        </w:rPr>
+        <w:t>“TG_TABLE_NAME”</w:t>
+      </w:r>
+      <w:r>
+        <w:rPr>
+          <w:szCs w:val="20"/>
+        </w:rPr>
+        <w:t>, as quais permitem identificar o tipo de operação e tabela</w:t>
+      </w:r>
+    </w:p>
+    <w:p>
+      <w:pPr>
+        <w:pStyle w:val="PargrafodaLista1"/>
+        <w:numPr>
+          <w:ilvl w:val="0"/>
+          <w:numId w:val="0"/>
+        </w:numPr>
+        <w:ind w:left="720" w:hanging="360"/>
+        <w:rPr>
+          <w:szCs w:val="20"/>
+        </w:rPr>
+      </w:pPr>
+      <w:r>
+        <w:rPr>
+          <w:szCs w:val="20"/>
+        </w:rPr>
+        <w:t xml:space="preserve">aquando a ativação do trigger e assim utilizando uma só função para validar os </w:t>
+      </w:r>
+    </w:p>
+    <w:p>
+      <w:pPr>
+        <w:pStyle w:val="PargrafodaLista1"/>
+        <w:numPr>
+          <w:ilvl w:val="0"/>
+          <w:numId w:val="0"/>
+        </w:numPr>
+        <w:ind w:left="720" w:hanging="360"/>
+        <w:rPr>
+          <w:szCs w:val="20"/>
+        </w:rPr>
+      </w:pPr>
+      <w:r>
+        <w:rPr>
+          <w:szCs w:val="20"/>
+        </w:rPr>
+        <w:t>duplicados</w:t>
+      </w:r>
+      <w:r>
+        <w:rPr>
+          <w:szCs w:val="20"/>
+        </w:rPr>
+        <w:t xml:space="preserve">. Utilizou-se o “RAISE EXCEPTION” para parar a inserção ou </w:t>
+      </w:r>
+    </w:p>
+    <w:p>
+      <w:pPr>
+        <w:pStyle w:val="PargrafodaLista1"/>
+        <w:numPr>
+          <w:ilvl w:val="0"/>
+          <w:numId w:val="0"/>
+        </w:numPr>
+        <w:ind w:left="720" w:hanging="360"/>
+        <w:rPr>
+          <w:szCs w:val="20"/>
+        </w:rPr>
+      </w:pPr>
+      <w:r>
+        <w:rPr>
+          <w:szCs w:val="20"/>
+        </w:rPr>
+        <w:t>atualização caso seja detactado um duplicado.</w:t>
+      </w:r>
+    </w:p>
+    <w:p>
+      <w:pPr>
+        <w:pStyle w:val="PargrafodaLista1"/>
+        <w:numPr>
+          <w:ilvl w:val="0"/>
+          <w:numId w:val="0"/>
+        </w:numPr>
+        <w:ind w:left="720" w:hanging="360"/>
+        <w:rPr>
+          <w:szCs w:val="20"/>
+        </w:rPr>
+      </w:pPr>
+    </w:p>
+    <w:p>
+      <w:pPr>
+        <w:pStyle w:val="PargrafodaLista1"/>
         <w:numPr>
           <w:ilvl w:val="0"/>
           <w:numId w:val="0"/>
@@ -1938,7 +2599,7 @@
     </w:p>
     <w:p>
       <w:pPr>
-        <w:pStyle w:val="ListParagraph"/>
+        <w:pStyle w:val="PargrafodaLista1"/>
         <w:numPr>
           <w:ilvl w:val="0"/>
           <w:numId w:val="0"/>
@@ -1988,7 +2649,7 @@
     </w:p>
     <w:p>
       <w:pPr>
-        <w:pStyle w:val="ListParagraph"/>
+        <w:pStyle w:val="PargrafodaLista1"/>
         <w:numPr>
           <w:ilvl w:val="0"/>
           <w:numId w:val="0"/>
@@ -1999,6 +2660,7 @@
         </w:rPr>
       </w:pPr>
       <w:r>
+        <w:lastRenderedPageBreak/>
         <w:drawing>
           <wp:inline distT="0" distB="0" distL="0" distR="0" wp14:anchorId="1953757E" wp14:editId="44D326D0">
             <wp:extent cx="5400040" cy="2419985"/>
@@ -2038,16 +2700,235 @@
     </w:p>
     <w:p>
       <w:pPr>
+        <w:spacing w:before="0" w:after="200"/>
+        <w:jc w:val="left"/>
+        <w:rPr>
+          <w:szCs w:val="20"/>
+        </w:rPr>
+      </w:pPr>
+      <w:r>
+        <w:rPr>
+          <w:szCs w:val="20"/>
+        </w:rPr>
+        <w:br w:type="page"/>
+      </w:r>
+    </w:p>
+    <w:p>
+      <w:pPr>
         <w:pStyle w:val="Ttulo2"/>
       </w:pPr>
+      <w:bookmarkStart w:id="3" w:name="_Toc231567859"/>
       <w:r>
         <w:lastRenderedPageBreak/>
         <w:t>Função fx-media-movel</w:t>
       </w:r>
-    </w:p>
-    <w:p>
-      <w:pPr>
-        <w:pStyle w:val="ListParagraph"/>
+      <w:bookmarkEnd w:id="3"/>
+    </w:p>
+    <w:p/>
+    <w:p>
+      <w:r>
+        <w:t>Esta função tem como objetivo</w:t>
+      </w:r>
+      <w:r>
+        <w:t xml:space="preserve"> a produção de uma listagem de portefolio </w:t>
+      </w:r>
+      <w:r>
+        <w:t>incluindo o ISIN, a quantidade, o</w:t>
+      </w:r>
+      <w:r>
+        <w:t xml:space="preserve"> </w:t>
+      </w:r>
+      <w:r>
+        <w:t>valor actual, e a percentagem de varia</w:t>
+      </w:r>
+      <w:r>
+        <w:t xml:space="preserve">ção. Optou-se pelo retorno de uma tabela com os campos </w:t>
+      </w:r>
+      <w:r>
+        <w:t>mencionados, para tal, com recurso ao identificador do portefólio é possível os dados pedidos com um junção das tabelas posicao e dados_fundamentais as quais contém ISIN do instrumento, a quantidade, valor atual e percentagem de variação.</w:t>
+      </w:r>
+    </w:p>
+    <w:p>
+      <w:r>
+        <w:t xml:space="preserve">É possível utilizar o </w:t>
+      </w:r>
+      <w:r>
+        <w:rPr>
+          <w:b/>
+          <w:bCs/>
+        </w:rPr>
+        <w:t>“RETURN QUERY”</w:t>
+      </w:r>
+      <w:r>
+        <w:rPr>
+          <w:b/>
+          <w:bCs/>
+        </w:rPr>
+        <w:t xml:space="preserve"> </w:t>
+      </w:r>
+      <w:r>
+        <w:t>porque o resultado</w:t>
+      </w:r>
+      <w:r>
+        <w:t xml:space="preserve"> da função corresponde diretamente ao resultado de uma consulta “</w:t>
+      </w:r>
+      <w:r>
+        <w:rPr>
+          <w:b/>
+          <w:bCs/>
+        </w:rPr>
+        <w:t>SELECT</w:t>
+      </w:r>
+      <w:r>
+        <w:rPr>
+          <w:b/>
+          <w:bCs/>
+        </w:rPr>
+        <w:t xml:space="preserve">”, </w:t>
+      </w:r>
+      <w:r>
+        <w:t>e assim é possível</w:t>
+      </w:r>
+      <w:r>
+        <w:rPr>
+          <w:b/>
+          <w:bCs/>
+        </w:rPr>
+        <w:t xml:space="preserve"> </w:t>
+      </w:r>
+      <w:r>
+        <w:t>preencher as co</w:t>
+      </w:r>
+      <w:r>
+        <w:t>lunas declaradas na função.</w:t>
+      </w:r>
+    </w:p>
+    <w:p>
+      <w:r>
+        <w:t xml:space="preserve">NOTA: Seria possível utilizar a view </w:t>
+      </w:r>
+      <w:r>
+        <w:rPr>
+          <w:b/>
+          <w:bCs/>
+        </w:rPr>
+        <w:t>“valor</w:t>
+      </w:r>
+      <w:r>
+        <w:rPr>
+          <w:b/>
+          <w:bCs/>
+        </w:rPr>
+        <w:t>_</w:t>
+      </w:r>
+      <w:r>
+        <w:rPr>
+          <w:b/>
+          <w:bCs/>
+        </w:rPr>
+        <w:t>posicao”</w:t>
+      </w:r>
+      <w:r>
+        <w:rPr>
+          <w:b/>
+          <w:bCs/>
+        </w:rPr>
+        <w:t xml:space="preserve"> </w:t>
+      </w:r>
+      <w:r>
+        <w:t>se adicionarmos a coluna ” variacao_de_percentagem_diária” da tabela “dados_fundamentais”. Com esta opção evitariamos a utilização da junção de tabelas e apenas necessitarimos de executar a query à view.</w:t>
+      </w:r>
+    </w:p>
+    <w:p/>
+    <w:p/>
+    <w:p>
+      <w:r>
+        <w:drawing>
+          <wp:inline distT="0" distB="0" distL="0" distR="0" wp14:anchorId="2242F2AA" wp14:editId="740D6CC1">
+            <wp:extent cx="5400040" cy="3752850"/>
+            <wp:effectExtent l="0" t="0" r="0" b="0"/>
+            <wp:docPr id="540464526" name="Imagem 1"/>
+            <wp:cNvGraphicFramePr>
+              <a:graphicFrameLocks xmlns:a="http://schemas.openxmlformats.org/drawingml/2006/main" noChangeAspect="1"/>
+            </wp:cNvGraphicFramePr>
+            <a:graphic xmlns:a="http://schemas.openxmlformats.org/drawingml/2006/main">
+              <a:graphicData uri="http://schemas.openxmlformats.org/drawingml/2006/picture">
+                <pic:pic xmlns:pic="http://schemas.openxmlformats.org/drawingml/2006/picture">
+                  <pic:nvPicPr>
+                    <pic:cNvPr id="540464526" name=""/>
+                    <pic:cNvPicPr/>
+                  </pic:nvPicPr>
+                  <pic:blipFill>
+                    <a:blip r:embed="rId18"/>
+                    <a:stretch>
+                      <a:fillRect/>
+                    </a:stretch>
+                  </pic:blipFill>
+                  <pic:spPr>
+                    <a:xfrm>
+                      <a:off x="0" y="0"/>
+                      <a:ext cx="5400040" cy="3752850"/>
+                    </a:xfrm>
+                    <a:prstGeom prst="rect">
+                      <a:avLst/>
+                    </a:prstGeom>
+                  </pic:spPr>
+                </pic:pic>
+              </a:graphicData>
+            </a:graphic>
+          </wp:inline>
+        </w:drawing>
+      </w:r>
+    </w:p>
+    <w:p/>
+    <w:p/>
+    <w:p>
+      <w:pPr>
+        <w:spacing w:before="0" w:after="200"/>
+        <w:jc w:val="left"/>
+      </w:pPr>
+      <w:r>
+        <w:br w:type="page"/>
+      </w:r>
+    </w:p>
+    <w:p>
+      <w:pPr>
+        <w:pStyle w:val="Ttulo2"/>
+      </w:pPr>
+      <w:bookmarkStart w:id="4" w:name="_Toc231567860"/>
+      <w:r>
+        <w:lastRenderedPageBreak/>
+        <w:t>Função Portefolio_info</w:t>
+      </w:r>
+      <w:bookmarkEnd w:id="4"/>
+    </w:p>
+    <w:p/>
+    <w:p>
+      <w:pPr>
+        <w:spacing w:before="0" w:after="200"/>
+        <w:jc w:val="left"/>
+      </w:pPr>
+      <w:r>
+        <w:br w:type="page"/>
+      </w:r>
+    </w:p>
+    <w:p>
+      <w:pPr>
+        <w:pStyle w:val="Ttulo2"/>
+      </w:pPr>
+      <w:bookmarkStart w:id="5" w:name="_Toc231567861"/>
+      <w:r>
+        <w:rPr>
+          <w:lang w:val="pt-BR"/>
+        </w:rPr>
+        <w:lastRenderedPageBreak/>
+        <w:t>Procedimento p_actualizaValorDiario</w:t>
+      </w:r>
+      <w:bookmarkEnd w:id="5"/>
+    </w:p>
+    <w:p>
+      <w:pPr>
+        <w:pStyle w:val="PargrafodaLista1"/>
         <w:numPr>
           <w:ilvl w:val="0"/>
           <w:numId w:val="0"/>
@@ -2057,330 +2938,252 @@
     </w:p>
     <w:p>
       <w:pPr>
-        <w:pStyle w:val="ListParagraph"/>
+        <w:spacing w:before="0" w:after="200"/>
+        <w:jc w:val="left"/>
+        <w:rPr>
+          <w:lang w:val="pt-BR"/>
+        </w:rPr>
+      </w:pPr>
+      <w:r>
+        <w:rPr>
+          <w:lang w:val="pt-BR"/>
+        </w:rPr>
+        <w:br w:type="page"/>
+      </w:r>
+    </w:p>
+    <w:p>
+      <w:pPr>
+        <w:pStyle w:val="Ttulo2"/>
+      </w:pPr>
+      <w:bookmarkStart w:id="6" w:name="_Toc231567862"/>
+      <w:r>
+        <w:rPr>
+          <w:lang w:val="pt-BR"/>
+        </w:rPr>
+        <w:lastRenderedPageBreak/>
+        <w:t>Vista contacto_cliente</w:t>
+      </w:r>
+      <w:bookmarkEnd w:id="6"/>
+    </w:p>
+    <w:p>
+      <w:pPr>
+        <w:pStyle w:val="PargrafodaLista1"/>
         <w:numPr>
           <w:ilvl w:val="0"/>
           <w:numId w:val="0"/>
         </w:numPr>
         <w:ind w:left="720" w:hanging="360"/>
-      </w:pPr>
+        <w:rPr>
+          <w:lang w:val="pt-BR"/>
+        </w:rPr>
+      </w:pPr>
+    </w:p>
+    <w:p>
+      <w:pPr>
+        <w:spacing w:before="0" w:after="200"/>
+        <w:jc w:val="left"/>
+        <w:rPr>
+          <w:lang w:val="pt-BR"/>
+        </w:rPr>
+      </w:pPr>
+      <w:r>
+        <w:rPr>
+          <w:lang w:val="pt-BR"/>
+        </w:rPr>
+        <w:br w:type="page"/>
+      </w:r>
     </w:p>
     <w:p>
       <w:pPr>
         <w:pStyle w:val="Ttulo2"/>
       </w:pPr>
-      <w:r>
-        <w:t>Função Portefolio_info</w:t>
-      </w:r>
-    </w:p>
-    <w:p>
-      <w:pPr>
-        <w:pStyle w:val="ListParagraph"/>
-        <w:numPr>
-          <w:ilvl w:val="0"/>
-          <w:numId w:val="0"/>
-        </w:numPr>
-        <w:ind w:left="720" w:hanging="360"/>
-      </w:pPr>
-    </w:p>
-    <w:p>
-      <w:pPr>
-        <w:pStyle w:val="ListParagraph"/>
-        <w:numPr>
-          <w:ilvl w:val="0"/>
-          <w:numId w:val="0"/>
-        </w:numPr>
-        <w:ind w:left="720" w:hanging="360"/>
-      </w:pPr>
+      <w:bookmarkStart w:id="7" w:name="_Toc231567863"/>
+      <w:r>
+        <w:lastRenderedPageBreak/>
+        <w:t>Aplicação Java</w:t>
+      </w:r>
+      <w:bookmarkEnd w:id="7"/>
+    </w:p>
+    <w:p/>
+    <w:p>
+      <w:pPr>
+        <w:pStyle w:val="PargrafodaLista1"/>
+        <w:rPr>
+          <w:bCs/>
+          <w:szCs w:val="20"/>
+        </w:rPr>
+      </w:pPr>
+      <w:r>
+        <w:rPr>
+          <w:lang w:val="pt-BR"/>
+        </w:rPr>
+        <w:t xml:space="preserve">Criar um cliente e respectivo </w:t>
+      </w:r>
+      <w:r>
+        <w:rPr>
+          <w:lang w:val="pt-BR"/>
+        </w:rPr>
+        <w:t>contacto</w:t>
+      </w:r>
+    </w:p>
+    <w:p>
+      <w:pPr>
+        <w:pStyle w:val="PargrafodaLista1"/>
+        <w:rPr>
+          <w:bCs/>
+          <w:szCs w:val="20"/>
+        </w:rPr>
+      </w:pPr>
+      <w:r>
+        <w:rPr>
+          <w:bCs/>
+          <w:szCs w:val="20"/>
+          <w:lang w:val="pt-BR"/>
+        </w:rPr>
+        <w:t>Criar um port</w:t>
+      </w:r>
+      <w:r>
+        <w:rPr>
+          <w:bCs/>
+          <w:szCs w:val="20"/>
+          <w:lang w:val="pt-BR"/>
+        </w:rPr>
+        <w:t>efó</w:t>
+      </w:r>
+      <w:r>
+        <w:rPr>
+          <w:bCs/>
+          <w:szCs w:val="20"/>
+          <w:lang w:val="pt-BR"/>
+        </w:rPr>
+        <w:t>lio de um cliente</w:t>
+      </w:r>
+    </w:p>
+    <w:p>
+      <w:pPr>
+        <w:pStyle w:val="PargrafodaLista1"/>
+        <w:rPr>
+          <w:bCs/>
+          <w:szCs w:val="20"/>
+        </w:rPr>
+      </w:pPr>
+      <w:r>
+        <w:rPr>
+          <w:bCs/>
+          <w:szCs w:val="20"/>
+        </w:rPr>
+        <w:t>Listar as posi</w:t>
+      </w:r>
+      <w:r>
+        <w:rPr>
+          <w:bCs/>
+          <w:szCs w:val="20"/>
+        </w:rPr>
+        <w:t>çõ</w:t>
+      </w:r>
+      <w:r>
+        <w:rPr>
+          <w:bCs/>
+          <w:szCs w:val="20"/>
+        </w:rPr>
+        <w:t>es de um cliente</w:t>
+      </w:r>
+    </w:p>
+    <w:p>
+      <w:pPr>
+        <w:pStyle w:val="PargrafodaLista1"/>
+        <w:rPr>
+          <w:bCs/>
+          <w:szCs w:val="20"/>
+        </w:rPr>
+      </w:pPr>
+      <w:r>
+        <w:rPr>
+          <w:bCs/>
+          <w:szCs w:val="20"/>
+          <w:lang w:val="pt-BR"/>
+        </w:rPr>
+        <w:t>Actualizar o valor di</w:t>
+      </w:r>
+      <w:r>
+        <w:rPr>
+          <w:bCs/>
+          <w:szCs w:val="20"/>
+          <w:lang w:val="pt-BR"/>
+        </w:rPr>
+        <w:t>ário</w:t>
+      </w:r>
+      <w:r>
+        <w:rPr>
+          <w:bCs/>
+          <w:szCs w:val="20"/>
+          <w:lang w:val="pt-BR"/>
+        </w:rPr>
+        <w:t xml:space="preserve"> de um instrumento</w:t>
+      </w:r>
+    </w:p>
+    <w:p>
+      <w:pPr>
+        <w:pStyle w:val="PargrafodaLista1"/>
+        <w:rPr>
+          <w:bCs/>
+          <w:szCs w:val="20"/>
+        </w:rPr>
+      </w:pPr>
+      <w:r>
+        <w:rPr>
+          <w:bCs/>
+          <w:szCs w:val="20"/>
+          <w:lang w:val="pt-BR"/>
+        </w:rPr>
+        <w:t>Actualiza</w:t>
+      </w:r>
+      <w:r>
+        <w:rPr>
+          <w:bCs/>
+          <w:szCs w:val="20"/>
+          <w:lang w:val="pt-BR"/>
+        </w:rPr>
+        <w:t>ção</w:t>
+      </w:r>
+      <w:r>
+        <w:rPr>
+          <w:bCs/>
+          <w:szCs w:val="20"/>
+          <w:lang w:val="pt-BR"/>
+        </w:rPr>
+        <w:t xml:space="preserve"> dos dados de um cliente</w:t>
+      </w:r>
+    </w:p>
+    <w:p>
+      <w:pPr>
+        <w:spacing w:before="0" w:after="200"/>
+        <w:jc w:val="left"/>
+        <w:rPr>
+          <w:bCs/>
+          <w:szCs w:val="20"/>
+        </w:rPr>
+      </w:pPr>
+      <w:r>
+        <w:rPr>
+          <w:bCs/>
+          <w:szCs w:val="20"/>
+        </w:rPr>
+        <w:br w:type="page"/>
+      </w:r>
     </w:p>
     <w:p>
       <w:pPr>
         <w:pStyle w:val="Ttulo2"/>
       </w:pPr>
-      <w:r>
-        <w:rPr>
-          <w:lang w:val="en-GB"/>
-        </w:rPr>
-        <w:t>Procedimento</w:t>
-      </w:r>
-      <w:r>
-        <w:rPr>
-          <w:lang w:val="en-GB"/>
-        </w:rPr>
-        <w:t xml:space="preserve"> p</w:t>
-      </w:r>
-      <w:r>
-        <w:rPr>
-          <w:lang w:val="en-GB"/>
-        </w:rPr>
-        <w:t>_</w:t>
-      </w:r>
-      <w:r>
-        <w:rPr>
-          <w:lang w:val="en-GB"/>
-        </w:rPr>
-        <w:t>actualizaValorDiario</w:t>
-      </w:r>
-    </w:p>
-    <w:p>
-      <w:pPr>
-        <w:pStyle w:val="ListParagraph"/>
-        <w:numPr>
-          <w:ilvl w:val="0"/>
-          <w:numId w:val="0"/>
-        </w:numPr>
-        <w:ind w:left="720" w:hanging="360"/>
-      </w:pPr>
-    </w:p>
-    <w:p>
-      <w:pPr>
-        <w:pStyle w:val="ListParagraph"/>
-        <w:numPr>
-          <w:ilvl w:val="0"/>
-          <w:numId w:val="0"/>
-        </w:numPr>
-        <w:ind w:left="720" w:hanging="360"/>
-        <w:rPr>
-          <w:lang w:val="en-GB"/>
-        </w:rPr>
-      </w:pPr>
-    </w:p>
-    <w:p>
-      <w:pPr>
-        <w:pStyle w:val="Ttulo2"/>
-      </w:pPr>
-      <w:r>
-        <w:rPr>
-          <w:lang w:val="en-GB"/>
-        </w:rPr>
-        <w:t>Vista</w:t>
-      </w:r>
-      <w:r>
-        <w:rPr>
-          <w:lang w:val="en-GB"/>
-        </w:rPr>
-        <w:t xml:space="preserve"> contacto</w:t>
-      </w:r>
-      <w:r>
-        <w:rPr>
-          <w:lang w:val="en-GB"/>
-        </w:rPr>
-        <w:t>_</w:t>
-      </w:r>
-      <w:r>
-        <w:rPr>
-          <w:lang w:val="en-GB"/>
-        </w:rPr>
-        <w:t>cliente</w:t>
-      </w:r>
-    </w:p>
-    <w:p>
-      <w:pPr>
-        <w:pStyle w:val="ListParagraph"/>
-        <w:numPr>
-          <w:ilvl w:val="0"/>
-          <w:numId w:val="0"/>
-        </w:numPr>
-        <w:ind w:left="720" w:hanging="360"/>
-        <w:rPr>
-          <w:lang w:val="en-GB"/>
-        </w:rPr>
-      </w:pPr>
-    </w:p>
-    <w:p>
-      <w:pPr>
-        <w:pStyle w:val="ListParagraph"/>
-        <w:numPr>
-          <w:ilvl w:val="0"/>
-          <w:numId w:val="0"/>
-        </w:numPr>
-        <w:ind w:left="720" w:hanging="360"/>
-        <w:rPr>
-          <w:lang w:val="en-GB"/>
-        </w:rPr>
-      </w:pPr>
-    </w:p>
-    <w:p>
-      <w:pPr>
-        <w:pStyle w:val="Ttulo2"/>
-      </w:pPr>
-      <w:r>
-        <w:t>Aplicação Java</w:t>
-      </w:r>
+      <w:bookmarkStart w:id="8" w:name="_Toc231567864"/>
+      <w:r>
+        <w:lastRenderedPageBreak/>
+        <w:t>Teste Optimistic Locking</w:t>
+      </w:r>
+      <w:bookmarkEnd w:id="8"/>
     </w:p>
     <w:p/>
-    <w:p>
-      <w:pPr>
-        <w:pStyle w:val="ListParagraph"/>
-        <w:rPr>
-          <w:bCs/>
-          <w:szCs w:val="20"/>
-        </w:rPr>
-      </w:pPr>
-      <w:r>
-        <w:rPr>
-          <w:lang w:val="pt-BR"/>
-        </w:rPr>
-        <w:t xml:space="preserve">Criar um cliente e respectivo </w:t>
-      </w:r>
-      <w:r>
-        <w:rPr>
-          <w:lang w:val="pt-BR"/>
-        </w:rPr>
-        <w:t>contacto</w:t>
-      </w:r>
-    </w:p>
-    <w:p>
-      <w:pPr>
-        <w:pStyle w:val="ListParagraph"/>
-        <w:rPr>
-          <w:bCs/>
-          <w:szCs w:val="20"/>
-        </w:rPr>
-      </w:pPr>
-      <w:r>
-        <w:rPr>
-          <w:bCs/>
-          <w:szCs w:val="20"/>
-          <w:lang w:val="pt-BR"/>
-        </w:rPr>
-        <w:t>Criar um port</w:t>
-      </w:r>
-      <w:r>
-        <w:rPr>
-          <w:bCs/>
-          <w:szCs w:val="20"/>
-          <w:lang w:val="pt-BR"/>
-        </w:rPr>
-        <w:t>efó</w:t>
-      </w:r>
-      <w:r>
-        <w:rPr>
-          <w:bCs/>
-          <w:szCs w:val="20"/>
-          <w:lang w:val="pt-BR"/>
-        </w:rPr>
-        <w:t>lio de um cliente</w:t>
-      </w:r>
-    </w:p>
-    <w:p>
-      <w:pPr>
-        <w:pStyle w:val="ListParagraph"/>
-        <w:rPr>
-          <w:bCs/>
-          <w:szCs w:val="20"/>
-        </w:rPr>
-      </w:pPr>
-      <w:r>
-        <w:rPr>
-          <w:bCs/>
-          <w:szCs w:val="20"/>
-        </w:rPr>
-        <w:t>Listar as posi</w:t>
-      </w:r>
-      <w:r>
-        <w:rPr>
-          <w:bCs/>
-          <w:szCs w:val="20"/>
-        </w:rPr>
-        <w:t>çõ</w:t>
-      </w:r>
-      <w:r>
-        <w:rPr>
-          <w:bCs/>
-          <w:szCs w:val="20"/>
-        </w:rPr>
-        <w:t>es de um cliente</w:t>
-      </w:r>
-    </w:p>
-    <w:p>
-      <w:pPr>
-        <w:pStyle w:val="ListParagraph"/>
-        <w:rPr>
-          <w:bCs/>
-          <w:szCs w:val="20"/>
-        </w:rPr>
-      </w:pPr>
-      <w:r>
-        <w:rPr>
-          <w:bCs/>
-          <w:szCs w:val="20"/>
-          <w:lang w:val="pt-BR"/>
-        </w:rPr>
-        <w:t>Actualizar o valor di</w:t>
-      </w:r>
-      <w:r>
-        <w:rPr>
-          <w:bCs/>
-          <w:szCs w:val="20"/>
-          <w:lang w:val="pt-BR"/>
-        </w:rPr>
-        <w:t>ário</w:t>
-      </w:r>
-      <w:r>
-        <w:rPr>
-          <w:bCs/>
-          <w:szCs w:val="20"/>
-          <w:lang w:val="pt-BR"/>
-        </w:rPr>
-        <w:t xml:space="preserve"> de um instrumento</w:t>
-      </w:r>
-    </w:p>
-    <w:p>
-      <w:pPr>
-        <w:pStyle w:val="ListParagraph"/>
-        <w:rPr>
-          <w:bCs/>
-          <w:szCs w:val="20"/>
-        </w:rPr>
-      </w:pPr>
-      <w:r>
-        <w:rPr>
-          <w:bCs/>
-          <w:szCs w:val="20"/>
-          <w:lang w:val="pt-BR"/>
-        </w:rPr>
-        <w:t>Actualiza</w:t>
-      </w:r>
-      <w:r>
-        <w:rPr>
-          <w:bCs/>
-          <w:szCs w:val="20"/>
-          <w:lang w:val="pt-BR"/>
-        </w:rPr>
-        <w:t>ção</w:t>
-      </w:r>
-      <w:r>
-        <w:rPr>
-          <w:bCs/>
-          <w:szCs w:val="20"/>
-          <w:lang w:val="pt-BR"/>
-        </w:rPr>
-        <w:t xml:space="preserve"> dos dados de um cliente</w:t>
-      </w:r>
-    </w:p>
-    <w:p>
-      <w:pPr>
-        <w:pStyle w:val="ListParagraph"/>
-        <w:numPr>
-          <w:ilvl w:val="0"/>
-          <w:numId w:val="0"/>
-        </w:numPr>
-        <w:ind w:left="720" w:hanging="360"/>
-        <w:rPr>
-          <w:bCs/>
-          <w:szCs w:val="20"/>
-        </w:rPr>
-      </w:pPr>
-    </w:p>
-    <w:p>
-      <w:pPr>
-        <w:pStyle w:val="Ttulo2"/>
-      </w:pPr>
-      <w:r>
-        <w:t>Teste Optimistic Locking</w:t>
-      </w:r>
-    </w:p>
     <w:p>
       <w:pPr>
         <w:pStyle w:val="Ttulo"/>
@@ -2679,7 +3482,6 @@
         <w:rPr>
           <w:szCs w:val="20"/>
         </w:rPr>
-        <w:lastRenderedPageBreak/>
         <w:t>Bibliografia</w:t>
       </w:r>
       <w:r>
@@ -3387,6 +4189,7 @@
         <w:rPr>
           <w:szCs w:val="20"/>
         </w:rPr>
+        <w:lastRenderedPageBreak/>
         <w:t>A</w:t>
       </w:r>
       <w:r>
@@ -3631,123 +4434,378 @@
         <w:rPr>
           <w:szCs w:val="20"/>
         </w:rPr>
+        <w:t>Artigos</w:t>
+      </w:r>
+      <w:r>
+        <w:rPr>
+          <w:szCs w:val="20"/>
+        </w:rPr>
+        <w:t>:</w:t>
+      </w:r>
+      <w:r>
+        <w:rPr>
+          <w:szCs w:val="20"/>
+        </w:rPr>
+        <w:t xml:space="preserve"> Deve citar aqueles que </w:t>
+      </w:r>
+      <w:r>
+        <w:rPr>
+          <w:szCs w:val="20"/>
+        </w:rPr>
+        <w:t>estão</w:t>
+      </w:r>
+      <w:r>
+        <w:rPr>
+          <w:szCs w:val="20"/>
+        </w:rPr>
+        <w:t xml:space="preserve"> indexados e submeti</w:t>
+      </w:r>
+      <w:r>
+        <w:rPr>
+          <w:szCs w:val="20"/>
+        </w:rPr>
+        <w:t>dos a revisão independente. No I</w:t>
+      </w:r>
+      <w:r>
+        <w:rPr>
+          <w:szCs w:val="20"/>
+        </w:rPr>
+        <w:t>nstituto Thomson Reuters</w:t>
+      </w:r>
+      <w:r>
+        <w:rPr>
+          <w:szCs w:val="20"/>
+        </w:rPr>
+        <w:t>,</w:t>
+      </w:r>
+      <w:r>
+        <w:rPr>
+          <w:szCs w:val="20"/>
+        </w:rPr>
+        <w:t xml:space="preserve"> são fornecidas listas de toda a bibliografia que </w:t>
+      </w:r>
+      <w:r>
+        <w:rPr>
+          <w:szCs w:val="20"/>
+        </w:rPr>
+        <w:t>atend</w:t>
+      </w:r>
+      <w:r>
+        <w:rPr>
+          <w:szCs w:val="20"/>
+        </w:rPr>
+        <w:t>e a esse grau de exigência.</w:t>
+      </w:r>
+    </w:p>
+    <w:p>
+      <w:pPr>
+        <w:rPr>
+          <w:szCs w:val="20"/>
+        </w:rPr>
+      </w:pPr>
+      <w:r>
+        <w:rPr>
+          <w:szCs w:val="20"/>
+        </w:rPr>
+        <w:t>Trabalhos</w:t>
+      </w:r>
+      <w:r>
+        <w:rPr>
+          <w:szCs w:val="20"/>
+        </w:rPr>
+        <w:t>:</w:t>
+      </w:r>
+      <w:r>
+        <w:rPr>
+          <w:szCs w:val="20"/>
+        </w:rPr>
+        <w:t xml:space="preserve"> Se o trabalho citado não tiver data, coloque o nome do autor seguido da indicação “sem data”. Se a citação for relativa a uma comunicação pessoal, </w:t>
+      </w:r>
+      <w:r>
+        <w:rPr>
+          <w:szCs w:val="20"/>
+        </w:rPr>
+        <w:t>faça-a</w:t>
+      </w:r>
+      <w:r>
+        <w:rPr>
+          <w:szCs w:val="20"/>
+        </w:rPr>
+        <w:t xml:space="preserve"> do modo seguinte: M. Mjhdsh (comunicação pessoal, 13 de </w:t>
+      </w:r>
+      <w:r>
+        <w:rPr>
+          <w:szCs w:val="20"/>
+        </w:rPr>
+        <w:t>março de</w:t>
+      </w:r>
+      <w:r>
+        <w:rPr>
+          <w:szCs w:val="20"/>
+        </w:rPr>
+        <w:t xml:space="preserve"> 2017). Noutros trabalhos não publicados, deve constar a seguinte informação: “Dissertação (ou, Relatório) de Mestrado (ou Doutoramento, ou Final de Curso) não publicada(o)</w:t>
+      </w:r>
+      <w:r>
+        <w:rPr>
+          <w:szCs w:val="20"/>
+        </w:rPr>
+        <w:t>”</w:t>
+      </w:r>
+      <w:r>
+        <w:rPr>
+          <w:szCs w:val="20"/>
+        </w:rPr>
+        <w:t>.</w:t>
+      </w:r>
+    </w:p>
+    <w:p>
+      <w:pPr>
+        <w:rPr>
+          <w:szCs w:val="20"/>
+        </w:rPr>
+      </w:pPr>
+      <w:r>
+        <w:rPr>
+          <w:szCs w:val="20"/>
+        </w:rPr>
+        <w:t>Por uma questão de simplificação, pode recorrer ao Google Académico</w:t>
+      </w:r>
+      <w:r>
+        <w:rPr>
+          <w:position w:val="10"/>
+          <w:szCs w:val="20"/>
+        </w:rPr>
+        <w:t xml:space="preserve">1 </w:t>
+      </w:r>
+      <w:r>
+        <w:rPr>
+          <w:szCs w:val="20"/>
+        </w:rPr>
+        <w:t>e retirar a informação que consta no sítio Citar no formato adequado.</w:t>
+      </w:r>
+    </w:p>
+    <w:p>
+      <w:pPr>
+        <w:pStyle w:val="Texto"/>
+        <w:rPr>
+          <w:b w:val="0"/>
+          <w:szCs w:val="20"/>
+        </w:rPr>
+      </w:pPr>
+      <w:r>
+        <w:rPr>
+          <w:b w:val="0"/>
+          <w:szCs w:val="20"/>
+        </w:rPr>
+        <w:t>No final</w:t>
+      </w:r>
+      <w:r>
+        <w:rPr>
+          <w:b w:val="0"/>
+          <w:szCs w:val="20"/>
+        </w:rPr>
+        <w:t>,</w:t>
+      </w:r>
+      <w:r>
+        <w:rPr>
+          <w:b w:val="0"/>
+          <w:szCs w:val="20"/>
+        </w:rPr>
+        <w:t xml:space="preserve"> agradece-se que o grave no formato </w:t>
+      </w:r>
+      <w:r>
+        <w:rPr>
+          <w:b w:val="0"/>
+          <w:szCs w:val="20"/>
+        </w:rPr>
+        <w:t>PDF</w:t>
+      </w:r>
+      <w:r>
+        <w:rPr>
+          <w:b w:val="0"/>
+          <w:szCs w:val="20"/>
+        </w:rPr>
+        <w:t>, assim</w:t>
+      </w:r>
+      <w:r>
+        <w:rPr>
+          <w:b w:val="0"/>
+          <w:szCs w:val="20"/>
+        </w:rPr>
+        <w:t>,</w:t>
+      </w:r>
+      <w:r>
+        <w:rPr>
+          <w:b w:val="0"/>
+          <w:szCs w:val="20"/>
+        </w:rPr>
+        <w:t xml:space="preserve"> garante-se a não desformatação do documento.</w:t>
+      </w:r>
+    </w:p>
+    <w:p>
+      <w:pPr>
+        <w:pStyle w:val="Texto"/>
+        <w:rPr>
+          <w:b w:val="0"/>
+          <w:szCs w:val="20"/>
+        </w:rPr>
+      </w:pPr>
+    </w:p>
+    <w:p>
+      <w:pPr>
+        <w:pStyle w:val="Ttulo1"/>
+      </w:pPr>
+      <w:bookmarkStart w:id="9" w:name="_Toc231567865"/>
+      <w:r>
+        <w:t>Tutorial</w:t>
+      </w:r>
+      <w:bookmarkEnd w:id="9"/>
+    </w:p>
+    <w:p>
+      <w:pPr>
+        <w:rPr>
+          <w:szCs w:val="20"/>
+        </w:rPr>
+      </w:pPr>
+      <w:r>
+        <w:rPr>
+          <w:szCs w:val="20"/>
+        </w:rPr>
+        <w:t xml:space="preserve">Este capítulo irá mostrar como inserir tabelas, figuras e/ou listagens. Considere-se que </w:t>
+      </w:r>
+      <w:r>
+        <w:rPr>
+          <w:szCs w:val="20"/>
+        </w:rPr>
+        <w:t xml:space="preserve">as </w:t>
+      </w:r>
+      <w:r>
+        <w:rPr>
+          <w:szCs w:val="20"/>
+        </w:rPr>
+        <w:t>listagens não são todo o código</w:t>
+      </w:r>
+      <w:r>
+        <w:rPr>
+          <w:szCs w:val="20"/>
+        </w:rPr>
+        <w:t>,</w:t>
+      </w:r>
+      <w:r>
+        <w:rPr>
+          <w:szCs w:val="20"/>
+        </w:rPr>
+        <w:t xml:space="preserve"> mas</w:t>
+      </w:r>
+      <w:r>
+        <w:rPr>
+          <w:szCs w:val="20"/>
+        </w:rPr>
+        <w:t xml:space="preserve"> apenas</w:t>
+      </w:r>
+      <w:r>
+        <w:rPr>
+          <w:szCs w:val="20"/>
+        </w:rPr>
+        <w:t xml:space="preserve"> partes </w:t>
+      </w:r>
+      <w:r>
+        <w:rPr>
+          <w:szCs w:val="20"/>
+        </w:rPr>
+        <w:t>dele</w:t>
+      </w:r>
+      <w:r>
+        <w:rPr>
+          <w:szCs w:val="20"/>
+        </w:rPr>
+        <w:t>. Estas irão su</w:t>
+      </w:r>
+      <w:r>
+        <w:rPr>
+          <w:szCs w:val="20"/>
+        </w:rPr>
+        <w:t>sten</w:t>
+      </w:r>
+      <w:r>
+        <w:rPr>
+          <w:szCs w:val="20"/>
+        </w:rPr>
+        <w:t>tar algumas frases dos parágrafos escritos. Não se esqueça, que todas as tabelas, figuras e listagens devem ser referenciadas no corpo do texto.</w:t>
+      </w:r>
+    </w:p>
+    <w:p>
+      <w:pPr>
+        <w:rPr>
+          <w:szCs w:val="20"/>
+        </w:rPr>
+      </w:pPr>
+      <w:r>
+        <w:rPr>
+          <w:szCs w:val="20"/>
+        </w:rPr>
         <w:lastRenderedPageBreak/>
-        <w:t>Artigos</w:t>
-      </w:r>
-      <w:r>
-        <w:rPr>
-          <w:szCs w:val="20"/>
-        </w:rPr>
-        <w:t>:</w:t>
-      </w:r>
-      <w:r>
-        <w:rPr>
-          <w:szCs w:val="20"/>
-        </w:rPr>
-        <w:t xml:space="preserve"> Deve citar aqueles que </w:t>
-      </w:r>
-      <w:r>
-        <w:rPr>
-          <w:szCs w:val="20"/>
-        </w:rPr>
-        <w:t>estão</w:t>
-      </w:r>
-      <w:r>
-        <w:rPr>
-          <w:szCs w:val="20"/>
-        </w:rPr>
-        <w:t xml:space="preserve"> indexados e submeti</w:t>
-      </w:r>
-      <w:r>
-        <w:rPr>
-          <w:szCs w:val="20"/>
-        </w:rPr>
-        <w:t>dos a revisão independente. No I</w:t>
-      </w:r>
-      <w:r>
-        <w:rPr>
-          <w:szCs w:val="20"/>
-        </w:rPr>
-        <w:t>nstituto Thomson Reuters</w:t>
-      </w:r>
-      <w:r>
-        <w:rPr>
-          <w:szCs w:val="20"/>
-        </w:rPr>
-        <w:t>,</w:t>
-      </w:r>
-      <w:r>
-        <w:rPr>
-          <w:szCs w:val="20"/>
-        </w:rPr>
-        <w:t xml:space="preserve"> são fornecidas listas de toda a bibliografia que </w:t>
-      </w:r>
-      <w:r>
-        <w:rPr>
-          <w:szCs w:val="20"/>
-        </w:rPr>
-        <w:t>atend</w:t>
-      </w:r>
-      <w:r>
-        <w:rPr>
-          <w:szCs w:val="20"/>
-        </w:rPr>
-        <w:t>e a esse grau de exigência.</w:t>
-      </w:r>
-    </w:p>
-    <w:p>
-      <w:pPr>
-        <w:rPr>
-          <w:szCs w:val="20"/>
-        </w:rPr>
-      </w:pPr>
-      <w:r>
-        <w:rPr>
-          <w:szCs w:val="20"/>
-        </w:rPr>
-        <w:t>Trabalhos</w:t>
-      </w:r>
-      <w:r>
-        <w:rPr>
-          <w:szCs w:val="20"/>
-        </w:rPr>
-        <w:t>:</w:t>
-      </w:r>
-      <w:r>
-        <w:rPr>
-          <w:szCs w:val="20"/>
-        </w:rPr>
-        <w:t xml:space="preserve"> Se o trabalho citado não tiver data, coloque o nome do autor seguido da indicação “sem data”. Se a citação for relativa a uma comunicação pessoal, </w:t>
-      </w:r>
-      <w:r>
-        <w:rPr>
-          <w:szCs w:val="20"/>
-        </w:rPr>
-        <w:t>faça-a</w:t>
-      </w:r>
-      <w:r>
-        <w:rPr>
-          <w:szCs w:val="20"/>
-        </w:rPr>
-        <w:t xml:space="preserve"> do modo seguinte: M. Mjhdsh (comunicação pessoal, 13 de </w:t>
-      </w:r>
-      <w:r>
-        <w:rPr>
-          <w:szCs w:val="20"/>
-        </w:rPr>
-        <w:t>março de</w:t>
-      </w:r>
-      <w:r>
-        <w:rPr>
-          <w:szCs w:val="20"/>
-        </w:rPr>
-        <w:t xml:space="preserve"> 2017). Noutros trabalhos não publicados, deve constar a seguinte informação: “Dissertação (ou, Relatório) de Mestrado (ou Doutoramento, ou Final de Curso) não publicada(o)</w:t>
-      </w:r>
-      <w:r>
-        <w:rPr>
-          <w:szCs w:val="20"/>
-        </w:rPr>
-        <w:t>”</w:t>
+        <w:t xml:space="preserve">As </w:t>
+      </w:r>
+      <w:r>
+        <w:rPr>
+          <w:szCs w:val="20"/>
+        </w:rPr>
+        <w:t>tabelas podem ser feitas no Word, powerpoint ou em qualquer outra aplicação, como, por exemplo,</w:t>
+      </w:r>
+      <w:r>
+        <w:rPr>
+          <w:szCs w:val="20"/>
+        </w:rPr>
+        <w:t xml:space="preserve"> a </w:t>
+      </w:r>
+      <w:r>
+        <w:rPr>
+          <w:szCs w:val="20"/>
+        </w:rPr>
+        <w:fldChar w:fldCharType="begin"/>
+      </w:r>
+      <w:r>
+        <w:rPr>
+          <w:szCs w:val="20"/>
+        </w:rPr>
+        <w:instrText xml:space="preserve"> REF _Ref351197168 \h </w:instrText>
+      </w:r>
+      <w:r>
+        <w:rPr>
+          <w:szCs w:val="20"/>
+        </w:rPr>
+        <w:instrText xml:space="preserve"> \* MERGEFORMAT </w:instrText>
+      </w:r>
+      <w:r>
+        <w:rPr>
+          <w:szCs w:val="20"/>
+        </w:rPr>
+      </w:r>
+      <w:r>
+        <w:rPr>
+          <w:szCs w:val="20"/>
+        </w:rPr>
+        <w:fldChar w:fldCharType="separate"/>
+      </w:r>
+      <w:r>
+        <w:rPr>
+          <w:szCs w:val="20"/>
+        </w:rPr>
+        <w:t>Tabela 1</w:t>
+      </w:r>
+      <w:r>
+        <w:rPr>
+          <w:szCs w:val="20"/>
+        </w:rPr>
+        <w:fldChar w:fldCharType="end"/>
+      </w:r>
+      <w:r>
+        <w:rPr>
+          <w:rStyle w:val="Refdenotaderodap"/>
+          <w:szCs w:val="20"/>
+        </w:rPr>
+        <w:footnoteReference w:id="1"/>
       </w:r>
       <w:r>
         <w:rPr>
@@ -3762,323 +4820,68 @@
           <w:szCs w:val="20"/>
         </w:rPr>
       </w:pPr>
-      <w:r>
-        <w:rPr>
-          <w:szCs w:val="20"/>
-        </w:rPr>
-        <w:t>Por uma questão de simplificação, pode recorrer ao Google Académico</w:t>
-      </w:r>
-      <w:r>
-        <w:rPr>
-          <w:position w:val="10"/>
-          <w:szCs w:val="20"/>
-        </w:rPr>
-        <w:t xml:space="preserve">1 </w:t>
-      </w:r>
-      <w:r>
-        <w:rPr>
-          <w:szCs w:val="20"/>
-        </w:rPr>
-        <w:t>e retirar a informação que consta no sítio Citar no formato adequado.</w:t>
-      </w:r>
-    </w:p>
-    <w:p>
-      <w:pPr>
-        <w:pStyle w:val="Texto"/>
-        <w:rPr>
-          <w:b w:val="0"/>
-          <w:szCs w:val="20"/>
-        </w:rPr>
-      </w:pPr>
-      <w:r>
-        <w:rPr>
-          <w:b w:val="0"/>
-          <w:szCs w:val="20"/>
-        </w:rPr>
-        <w:t>No final</w:t>
-      </w:r>
-      <w:r>
-        <w:rPr>
-          <w:b w:val="0"/>
-          <w:szCs w:val="20"/>
-        </w:rPr>
-        <w:t>,</w:t>
-      </w:r>
-      <w:r>
-        <w:rPr>
-          <w:b w:val="0"/>
-          <w:szCs w:val="20"/>
-        </w:rPr>
-        <w:t xml:space="preserve"> agradece-se que o grave no formato </w:t>
-      </w:r>
-      <w:r>
-        <w:rPr>
-          <w:b w:val="0"/>
-          <w:szCs w:val="20"/>
-        </w:rPr>
-        <w:t>PDF</w:t>
-      </w:r>
-      <w:r>
-        <w:rPr>
-          <w:b w:val="0"/>
-          <w:szCs w:val="20"/>
-        </w:rPr>
-        <w:t>, assim</w:t>
-      </w:r>
-      <w:r>
-        <w:rPr>
-          <w:b w:val="0"/>
-          <w:szCs w:val="20"/>
-        </w:rPr>
-        <w:t>,</w:t>
-      </w:r>
-      <w:r>
-        <w:rPr>
-          <w:b w:val="0"/>
-          <w:szCs w:val="20"/>
-        </w:rPr>
-        <w:t xml:space="preserve"> garante-se a não desformatação do documento.</w:t>
-      </w:r>
-    </w:p>
-    <w:p>
-      <w:pPr>
-        <w:pStyle w:val="Texto"/>
-        <w:rPr>
-          <w:b w:val="0"/>
-          <w:szCs w:val="20"/>
-        </w:rPr>
-      </w:pPr>
-    </w:p>
-    <w:p>
-      <w:pPr>
-        <w:pStyle w:val="Ttulo1"/>
-      </w:pPr>
-      <w:bookmarkStart w:id="1" w:name="_Toc351197351"/>
-      <w:r>
-        <w:t>Tutorial</w:t>
-      </w:r>
-      <w:bookmarkEnd w:id="1"/>
-    </w:p>
-    <w:p>
-      <w:pPr>
-        <w:rPr>
-          <w:szCs w:val="20"/>
-        </w:rPr>
-      </w:pPr>
-      <w:r>
-        <w:rPr>
-          <w:szCs w:val="20"/>
-        </w:rPr>
-        <w:t xml:space="preserve">Este capítulo irá mostrar como inserir tabelas, figuras e/ou listagens. Considere-se que </w:t>
-      </w:r>
-      <w:r>
-        <w:rPr>
-          <w:szCs w:val="20"/>
-        </w:rPr>
-        <w:t xml:space="preserve">as </w:t>
-      </w:r>
-      <w:r>
-        <w:rPr>
-          <w:szCs w:val="20"/>
-        </w:rPr>
-        <w:t>listagens não são todo o código</w:t>
-      </w:r>
-      <w:r>
-        <w:rPr>
-          <w:szCs w:val="20"/>
-        </w:rPr>
-        <w:t>,</w:t>
-      </w:r>
-      <w:r>
-        <w:rPr>
-          <w:szCs w:val="20"/>
-        </w:rPr>
-        <w:t xml:space="preserve"> mas</w:t>
-      </w:r>
-      <w:r>
-        <w:rPr>
-          <w:szCs w:val="20"/>
-        </w:rPr>
-        <w:t xml:space="preserve"> apenas</w:t>
-      </w:r>
-      <w:r>
-        <w:rPr>
-          <w:szCs w:val="20"/>
-        </w:rPr>
-        <w:t xml:space="preserve"> partes </w:t>
-      </w:r>
-      <w:r>
-        <w:rPr>
-          <w:szCs w:val="20"/>
-        </w:rPr>
-        <w:t>dele</w:t>
-      </w:r>
-      <w:r>
-        <w:rPr>
-          <w:szCs w:val="20"/>
-        </w:rPr>
-        <w:t>. Estas irão su</w:t>
-      </w:r>
-      <w:r>
-        <w:rPr>
-          <w:szCs w:val="20"/>
-        </w:rPr>
-        <w:t>sten</w:t>
-      </w:r>
-      <w:r>
-        <w:rPr>
-          <w:szCs w:val="20"/>
-        </w:rPr>
-        <w:t>tar algumas frases dos parágrafos escritos. Não se esqueça, que todas as tabelas, figuras e listagens devem ser referenciadas no corpo do texto.</w:t>
-      </w:r>
-    </w:p>
-    <w:p>
-      <w:pPr>
-        <w:rPr>
-          <w:szCs w:val="20"/>
-        </w:rPr>
-      </w:pPr>
-      <w:r>
-        <w:rPr>
-          <w:szCs w:val="20"/>
-        </w:rPr>
-        <w:t xml:space="preserve">As </w:t>
-      </w:r>
-      <w:r>
-        <w:rPr>
-          <w:szCs w:val="20"/>
-        </w:rPr>
-        <w:t>tabelas podem ser feitas no Word, powerpoint ou em qualquer outra aplicação, como, por exemplo,</w:t>
-      </w:r>
-      <w:r>
-        <w:rPr>
-          <w:szCs w:val="20"/>
-        </w:rPr>
-        <w:t xml:space="preserve"> a </w:t>
-      </w:r>
-      <w:r>
-        <w:rPr>
+    </w:p>
+    <w:p>
+      <w:pPr>
+        <w:pStyle w:val="Legenda"/>
+        <w:rPr>
+          <w:sz w:val="20"/>
+          <w:szCs w:val="20"/>
+        </w:rPr>
+      </w:pPr>
+      <w:bookmarkStart w:id="10" w:name="_Ref351197168"/>
+      <w:bookmarkStart w:id="11" w:name="_Toc351197333"/>
+      <w:r>
+        <w:rPr>
+          <w:sz w:val="20"/>
+          <w:szCs w:val="20"/>
+        </w:rPr>
+        <w:t xml:space="preserve">Tabela </w:t>
+      </w:r>
+      <w:r>
+        <w:rPr>
+          <w:sz w:val="20"/>
           <w:szCs w:val="20"/>
         </w:rPr>
         <w:fldChar w:fldCharType="begin"/>
       </w:r>
       <w:r>
         <w:rPr>
-          <w:szCs w:val="20"/>
-        </w:rPr>
-        <w:instrText xml:space="preserve"> REF _Ref351197168 \h </w:instrText>
-      </w:r>
-      <w:r>
-        <w:rPr>
-          <w:szCs w:val="20"/>
-        </w:rPr>
-        <w:instrText xml:space="preserve"> \* MERGEFORMAT </w:instrText>
-      </w:r>
-      <w:r>
-        <w:rPr>
-          <w:szCs w:val="20"/>
-        </w:rPr>
-      </w:r>
-      <w:r>
-        <w:rPr>
+          <w:sz w:val="20"/>
+          <w:szCs w:val="20"/>
+        </w:rPr>
+        <w:instrText xml:space="preserve"> SEQ Tabela \* ARABIC </w:instrText>
+      </w:r>
+      <w:r>
+        <w:rPr>
+          <w:sz w:val="20"/>
           <w:szCs w:val="20"/>
         </w:rPr>
         <w:fldChar w:fldCharType="separate"/>
       </w:r>
       <w:r>
         <w:rPr>
-          <w:szCs w:val="20"/>
-        </w:rPr>
-        <w:t>Tabela 1</w:t>
-      </w:r>
-      <w:r>
-        <w:rPr>
+          <w:sz w:val="20"/>
+          <w:szCs w:val="20"/>
+        </w:rPr>
+        <w:t>1</w:t>
+      </w:r>
+      <w:r>
+        <w:rPr>
+          <w:sz w:val="20"/>
           <w:szCs w:val="20"/>
         </w:rPr>
         <w:fldChar w:fldCharType="end"/>
       </w:r>
-      <w:r>
-        <w:rPr>
-          <w:rStyle w:val="Refdenotaderodap"/>
-          <w:szCs w:val="20"/>
-        </w:rPr>
-        <w:footnoteReference w:id="1"/>
-      </w:r>
-      <w:r>
-        <w:rPr>
-          <w:szCs w:val="20"/>
-        </w:rPr>
-        <w:t>.</w:t>
-      </w:r>
-    </w:p>
-    <w:p>
-      <w:pPr>
-        <w:rPr>
-          <w:szCs w:val="20"/>
-        </w:rPr>
-      </w:pPr>
-    </w:p>
-    <w:p>
-      <w:pPr>
-        <w:pStyle w:val="Legenda"/>
+      <w:bookmarkEnd w:id="10"/>
+      <w:r>
         <w:rPr>
           <w:sz w:val="20"/>
           <w:szCs w:val="20"/>
         </w:rPr>
-      </w:pPr>
-      <w:bookmarkStart w:id="2" w:name="_Ref351197168"/>
-      <w:bookmarkStart w:id="3" w:name="_Toc351197333"/>
-      <w:r>
-        <w:rPr>
-          <w:sz w:val="20"/>
-          <w:szCs w:val="20"/>
-        </w:rPr>
-        <w:t xml:space="preserve">Tabela </w:t>
-      </w:r>
-      <w:r>
-        <w:rPr>
-          <w:sz w:val="20"/>
-          <w:szCs w:val="20"/>
-        </w:rPr>
-        <w:fldChar w:fldCharType="begin"/>
-      </w:r>
-      <w:r>
-        <w:rPr>
-          <w:sz w:val="20"/>
-          <w:szCs w:val="20"/>
-        </w:rPr>
-        <w:instrText xml:space="preserve"> SEQ Tabela \* ARABIC </w:instrText>
-      </w:r>
-      <w:r>
-        <w:rPr>
-          <w:sz w:val="20"/>
-          <w:szCs w:val="20"/>
-        </w:rPr>
-        <w:fldChar w:fldCharType="separate"/>
-      </w:r>
-      <w:r>
-        <w:rPr>
-          <w:sz w:val="20"/>
-          <w:szCs w:val="20"/>
-        </w:rPr>
-        <w:t>1</w:t>
-      </w:r>
-      <w:r>
-        <w:rPr>
-          <w:sz w:val="20"/>
-          <w:szCs w:val="20"/>
-        </w:rPr>
-        <w:fldChar w:fldCharType="end"/>
-      </w:r>
-      <w:bookmarkEnd w:id="2"/>
-      <w:r>
-        <w:rPr>
-          <w:sz w:val="20"/>
-          <w:szCs w:val="20"/>
-        </w:rPr>
         <w:t xml:space="preserve"> – Tabela da operação XOR (exclusive OR)</w:t>
       </w:r>
-      <w:bookmarkEnd w:id="3"/>
+      <w:bookmarkEnd w:id="11"/>
     </w:p>
     <w:tbl>
       <w:tblPr>
@@ -4528,7 +5331,6 @@
           <w:szCs w:val="20"/>
           <w:lang w:val="en-US" w:eastAsia="en-US"/>
         </w:rPr>
-        <w:lastRenderedPageBreak/>
         <w:drawing>
           <wp:anchor distT="0" distB="0" distL="114300" distR="114300" simplePos="0" relativeHeight="251658240" behindDoc="0" locked="0" layoutInCell="1" allowOverlap="1" wp14:anchorId="0F09783A" wp14:editId="22C5FB3C">
             <wp:simplePos x="0" y="0"/>
@@ -4553,7 +5355,7 @@
                     <pic:cNvPicPr/>
                   </pic:nvPicPr>
                   <pic:blipFill>
-                    <a:blip r:embed="rId18">
+                    <a:blip r:embed="rId19">
                       <a:extLst>
                         <a:ext uri="{28A0092B-C50C-407E-A947-70E740481C1C}">
                           <a14:useLocalDpi xmlns:a14="http://schemas.microsoft.com/office/drawing/2010/main" val="0"/>
@@ -4617,7 +5419,7 @@
                     <pic:cNvPicPr/>
                   </pic:nvPicPr>
                   <pic:blipFill>
-                    <a:blip r:embed="rId19">
+                    <a:blip r:embed="rId20">
                       <a:extLst>
                         <a:ext uri="{28A0092B-C50C-407E-A947-70E740481C1C}">
                           <a14:useLocalDpi xmlns:a14="http://schemas.microsoft.com/office/drawing/2010/main" val="0"/>
@@ -4652,8 +5454,8 @@
           <w:szCs w:val="20"/>
         </w:rPr>
       </w:pPr>
-      <w:bookmarkStart w:id="4" w:name="_Ref351197256"/>
-      <w:bookmarkStart w:id="5" w:name="_Toc351197325"/>
+      <w:bookmarkStart w:id="12" w:name="_Ref351197256"/>
+      <w:bookmarkStart w:id="13" w:name="_Toc231567882"/>
       <w:r>
         <w:rPr>
           <w:sz w:val="20"/>
@@ -4696,7 +5498,7 @@
         </w:rPr>
         <w:fldChar w:fldCharType="end"/>
       </w:r>
-      <w:bookmarkEnd w:id="4"/>
+      <w:bookmarkEnd w:id="12"/>
       <w:r>
         <w:rPr>
           <w:sz w:val="20"/>
@@ -4711,7 +5513,7 @@
         </w:rPr>
         <w:t>Ilustração de uma imagem não vectorial (à esquerda) e vectorial (à direita)</w:t>
       </w:r>
-      <w:bookmarkEnd w:id="5"/>
+      <w:bookmarkEnd w:id="13"/>
     </w:p>
     <w:p>
       <w:pPr>
@@ -4807,6 +5609,7 @@
           <w:szCs w:val="20"/>
           <w:lang w:eastAsia="en-US"/>
         </w:rPr>
+        <w:lastRenderedPageBreak/>
         <mc:AlternateContent>
           <mc:Choice Requires="wps">
             <w:drawing>
@@ -5100,9 +5903,9 @@
           <w:szCs w:val="20"/>
         </w:rPr>
       </w:pPr>
-      <w:bookmarkStart w:id="6" w:name="_Ref1381358"/>
-      <w:bookmarkStart w:id="7" w:name="_Toc1381701"/>
-      <w:bookmarkStart w:id="8" w:name="_Toc1382120"/>
+      <w:bookmarkStart w:id="14" w:name="_Ref1381358"/>
+      <w:bookmarkStart w:id="15" w:name="_Toc1381701"/>
+      <w:bookmarkStart w:id="16" w:name="_Toc1382120"/>
       <w:r>
         <w:rPr>
           <w:sz w:val="20"/>
@@ -5145,7 +5948,7 @@
         </w:rPr>
         <w:fldChar w:fldCharType="end"/>
       </w:r>
-      <w:bookmarkEnd w:id="6"/>
+      <w:bookmarkEnd w:id="14"/>
       <w:r>
         <w:rPr>
           <w:sz w:val="20"/>
@@ -5168,8 +5971,8 @@
         </w:rPr>
         <w:t xml:space="preserve"> para obtenção do número mínimo de anos</w:t>
       </w:r>
-      <w:bookmarkEnd w:id="7"/>
-      <w:bookmarkEnd w:id="8"/>
+      <w:bookmarkEnd w:id="15"/>
+      <w:bookmarkEnd w:id="16"/>
     </w:p>
     <w:p>
       <w:pPr>
@@ -5264,7 +6067,7 @@
         </w:rPr>
         <w:t xml:space="preserve"> (</w:t>
       </w:r>
-      <w:hyperlink r:id="rId20" w:history="1">
+      <w:hyperlink r:id="rId21" w:history="1">
         <w:r>
           <w:rPr>
             <w:rStyle w:val="Hiperligao"/>
@@ -5517,8 +6320,40 @@
           <w:sz w:val="15"/>
           <w:szCs w:val="15"/>
         </w:rPr>
-        <w:lastRenderedPageBreak/>
-        <w:t xml:space="preserve">    PemailUtilizador =  </w:t>
+        <w:t xml:space="preserve">    </w:t>
+      </w:r>
+      <w:proofErr w:type="spellStart"/>
+      <w:r>
+        <w:rPr>
+          <w:rFonts w:ascii="Menlo" w:hAnsi="Menlo" w:cs="Menlo"/>
+          <w:noProof w:val="0"/>
+          <w:color w:val="000000"/>
+          <w:sz w:val="15"/>
+          <w:szCs w:val="15"/>
+        </w:rPr>
+        <w:t>PemailUtilizador</w:t>
+      </w:r>
+      <w:proofErr w:type="spellEnd"/>
+      <w:r>
+        <w:rPr>
+          <w:rFonts w:ascii="Menlo" w:hAnsi="Menlo" w:cs="Menlo"/>
+          <w:noProof w:val="0"/>
+          <w:color w:val="000000"/>
+          <w:sz w:val="15"/>
+          <w:szCs w:val="15"/>
+        </w:rPr>
+        <w:t xml:space="preserve"> </w:t>
+      </w:r>
+      <w:proofErr w:type="gramStart"/>
+      <w:r>
+        <w:rPr>
+          <w:rFonts w:ascii="Menlo" w:hAnsi="Menlo" w:cs="Menlo"/>
+          <w:noProof w:val="0"/>
+          <w:color w:val="000000"/>
+          <w:sz w:val="15"/>
+          <w:szCs w:val="15"/>
+        </w:rPr>
+        <w:t xml:space="preserve">=  </w:t>
       </w:r>
       <w:r>
         <w:rPr>
@@ -5528,7 +6363,18 @@
           <w:sz w:val="15"/>
           <w:szCs w:val="15"/>
         </w:rPr>
-        <w:t>'isel@email.com'</w:t>
+        <w:t>'isel@email.com</w:t>
+      </w:r>
+      <w:proofErr w:type="gramEnd"/>
+      <w:r>
+        <w:rPr>
+          <w:rFonts w:ascii="Menlo" w:hAnsi="Menlo" w:cs="Menlo"/>
+          <w:noProof w:val="0"/>
+          <w:color w:val="008000"/>
+          <w:sz w:val="15"/>
+          <w:szCs w:val="15"/>
+        </w:rPr>
+        <w:t>'</w:t>
       </w:r>
       <w:r>
         <w:rPr>
@@ -5557,7 +6403,29 @@
           <w:sz w:val="15"/>
           <w:szCs w:val="15"/>
         </w:rPr>
-        <w:t>--selecionar todos os tuplos de viagem cujo mail seja igual a</w:t>
+        <w:t xml:space="preserve">--selecionar todos os </w:t>
+      </w:r>
+      <w:proofErr w:type="spellStart"/>
+      <w:r>
+        <w:rPr>
+          <w:rFonts w:ascii="Menlo" w:hAnsi="Menlo" w:cs="Menlo"/>
+          <w:noProof w:val="0"/>
+          <w:color w:val="808080"/>
+          <w:sz w:val="15"/>
+          <w:szCs w:val="15"/>
+        </w:rPr>
+        <w:t>tuplos</w:t>
+      </w:r>
+      <w:proofErr w:type="spellEnd"/>
+      <w:r>
+        <w:rPr>
+          <w:rFonts w:ascii="Menlo" w:hAnsi="Menlo" w:cs="Menlo"/>
+          <w:noProof w:val="0"/>
+          <w:color w:val="808080"/>
+          <w:sz w:val="15"/>
+          <w:szCs w:val="15"/>
+        </w:rPr>
+        <w:t xml:space="preserve"> de viagem cujo mail seja igual a</w:t>
       </w:r>
       <w:r>
         <w:rPr>
@@ -5574,13 +6442,13 @@
       <w:pPr>
         <w:pStyle w:val="Legenda"/>
       </w:pPr>
-      <w:bookmarkStart w:id="9" w:name="_Ref1380928"/>
+      <w:bookmarkStart w:id="17" w:name="_Ref1380928"/>
       <w:r>
         <w:t xml:space="preserve"> </w:t>
       </w:r>
-      <w:bookmarkStart w:id="10" w:name="_Ref1381318"/>
-      <w:bookmarkStart w:id="11" w:name="_Toc1381702"/>
-      <w:bookmarkStart w:id="12" w:name="_Toc1382121"/>
+      <w:bookmarkStart w:id="18" w:name="_Ref1381318"/>
+      <w:bookmarkStart w:id="19" w:name="_Toc1381702"/>
+      <w:bookmarkStart w:id="20" w:name="_Toc1382121"/>
       <w:r>
         <w:t xml:space="preserve">Listagem </w:t>
       </w:r>
@@ -5599,13 +6467,13 @@
       <w:r>
         <w:fldChar w:fldCharType="end"/>
       </w:r>
-      <w:bookmarkEnd w:id="10"/>
+      <w:bookmarkEnd w:id="18"/>
       <w:r>
         <w:t xml:space="preserve"> Seleccionar todos os tuplos de VIAGEM cujo email é igual a ‘isel@email.com’</w:t>
       </w:r>
-      <w:bookmarkEnd w:id="9"/>
-      <w:bookmarkEnd w:id="11"/>
-      <w:bookmarkEnd w:id="12"/>
+      <w:bookmarkEnd w:id="17"/>
+      <w:bookmarkEnd w:id="19"/>
+      <w:bookmarkEnd w:id="20"/>
     </w:p>
     <w:p>
       <w:pPr>
@@ -5720,7 +6588,7 @@
           <w:lang w:val="en-US"/>
         </w:rPr>
         <w:sectPr>
-          <w:footerReference w:type="default" r:id="rId21"/>
+          <w:footerReference w:type="default" r:id="rId22"/>
           <w:pgSz w:w="11906" w:h="16838"/>
           <w:pgMar w:top="1417" w:right="1701" w:bottom="1417" w:left="1701" w:header="708" w:footer="708" w:gutter="0"/>
           <w:pgNumType w:start="1"/>
@@ -5734,12 +6602,12 @@
         <w:pStyle w:val="Ttulo1"/>
         <w:divId w:val="1254779091"/>
       </w:pPr>
-      <w:bookmarkStart w:id="13" w:name="_Toc351197352"/>
+      <w:bookmarkStart w:id="21" w:name="_Toc231567866"/>
       <w:r>
         <w:lastRenderedPageBreak/>
         <w:t>Referências</w:t>
       </w:r>
-      <w:bookmarkEnd w:id="13"/>
+      <w:bookmarkEnd w:id="21"/>
     </w:p>
     <w:p>
       <w:pPr>
@@ -6774,7 +7642,7 @@
     <w:lvl w:ilvl="0" w:tplc="D38663F8">
       <w:start w:val="1"/>
       <w:numFmt w:val="bullet"/>
-      <w:pStyle w:val="ListParagraph"/>
+      <w:pStyle w:val="PargrafodaLista1"/>
       <w:lvlText w:val=""/>
       <w:lvlJc w:val="left"/>
       <w:pPr>
@@ -8121,8 +8989,8 @@
     <w:unhideWhenUsed/>
     <w:rsid w:val="0019106B"/>
   </w:style>
-  <w:style w:type="paragraph" w:customStyle="1" w:styleId="ListParagraph">
-    <w:name w:val="List Paragraph"/>
+  <w:style w:type="paragraph" w:customStyle="1" w:styleId="PargrafodaLista1">
+    <w:name w:val="Parágrafo da Lista1"/>
     <w:basedOn w:val="Normal"/>
     <w:rsid w:val="00F5307F"/>
     <w:pPr>
@@ -8144,6 +9012,19 @@
       <w:sz w:val="26"/>
       <w:szCs w:val="26"/>
     </w:rPr>
+  </w:style>
+  <w:style w:type="paragraph" w:styleId="ndice2">
+    <w:name w:val="toc 2"/>
+    <w:basedOn w:val="Normal"/>
+    <w:next w:val="Normal"/>
+    <w:autoRedefine/>
+    <w:uiPriority w:val="39"/>
+    <w:unhideWhenUsed/>
+    <w:rsid w:val="006F6F4B"/>
+    <w:pPr>
+      <w:spacing w:after="100"/>
+      <w:ind w:left="200"/>
+    </w:pPr>
   </w:style>
 </w:styles>
 </file>

</xml_diff>